<commit_message>
EE series: merge nine books into seven (old 4+6 -> Book 4 RF, Microwave, and Transceivers; old 7+9 -> Book 7 Packaging, Layout, EMC, and Test; 5 -> 5, 8 -> 6); cross-references renumbered; Book 1/2 series tables at seven; KDP descriptions; root = 7 masters + KDP files; chapters/, notes/, scripts/ (nine-book tools in scripts/retired); old folders and leftovers moved to ignored bak/
</commit_message>
<xml_diff>
--- a/EE - Series/Circuits_Components_and_Control_Book2.docx
+++ b/EE - Series/Circuits_Components_and_Control_Book2.docx
@@ -104,7 +104,7 @@
         <w:spacing w:after="200" w:line="276" w:lineRule="auto"/>
       </w:pPr>
       <w:r>
-        <w:t xml:space="preserve">Chapter 10 introduces the control loop that runs underneath a robot model. Chapters 11–16 return to the op-amp with real numbers: feedback as a quantitative tool, followers and capacitive loads, bandwidth and slew rate, noise, DC errors, and comparators. Chapters 17–19 build classical control on that foundation, from plant and controller through PID and lead-lag compensation to the digital loop and its sampling delay. Chapters 20–23 turn to the practical side of real parts: reading an inductor datasheet, designing active filters to standard values, and the heat, drift, and impedance behavior of real resistors and capacitors. Chapters 24–28 close the book with five building blocks that join its two halves: the instrumentation amplifier, state feedback with observers, the sample-and-hold circuit, the voltage reference, and the H-bridge motor drive written as a plant for the loops of Chapters 17–19.</w:t>
+        <w:t xml:space="preserve">Chapter 10 introduces the control loop that runs underneath a robot model. Chapters 11–16 return to the op-amp with real numbers: feedback as a quantitative tool, followers and capacitive loads, bandwidth and slew rate, noise, DC errors, and comparators. Chapters 17–19 build classical control on that foundation, from plant and controller through PID and lead-lag compensation to the digital loop and its sampling delay. Chapters 20–23 turn to the practical side of real parts: reading an inductor datasheet, designing active filters to standard values, and the heat, drift, and impedance behavior of real resistors and capacitors. Chapters 24–28 add five building blocks that join its two halves: the instrumentation amplifier, state feedback with observers, the sample-and-hold circuit, the voltage reference, and the H-bridge motor drive written as a plant for the loops of Chapters 17–19. Chapters 29–32 complete both halves: the root locus and the stability margins and sensitivity peak on the control side, and oscillators and digital timing with metastability on the circuit side.</w:t>
       </w:r>
     </w:p>
     <w:p>
@@ -150,7 +150,7 @@
         <w:spacing w:after="200" w:line="276" w:lineRule="auto"/>
       </w:pPr>
       <w:r>
-        <w:t>This book is the second of nine, covering circuits, components, and the classical control loop that later sits under a robot model. Each book assumes only the books before it in the list below — never the ones after.</w:t>
+        <w:t>This book is the second of seven, covering circuits, components, and the classical control loop that later sits under a robot model. Each book assumes only the books before it in the list below — never the ones after.</w:t>
       </w:r>
     </w:p>
     <w:tbl>
@@ -301,7 +301,7 @@
           </w:tcPr>
           <w:p>
             <w:r>
-              <w:t>4. RF, Microwave, and Antennas</w:t>
+              <w:t>4. RF, Microwave, and Transceivers</w:t>
             </w:r>
           </w:p>
         </w:tc>
@@ -311,7 +311,7 @@
           </w:tcPr>
           <w:p>
             <w:r>
-              <w:t>Matching, lines, microwave, mmWave, antennas</w:t>
+              <w:t>Lines, matching, antennas, PAs, receivers, PLLs, radar</w:t>
             </w:r>
           </w:p>
         </w:tc>
@@ -357,63 +357,7 @@
           </w:tcPr>
           <w:p>
             <w:r>
-              <w:t>6. Transceivers and High-Power RF</w:t>
-            </w:r>
-          </w:p>
-        </w:tc>
-        <w:tc>
-          <w:tcPr>
-            <w:tcW w:w="0" w:type="auto"/>
-          </w:tcPr>
-          <w:p>
-            <w:r>
-              <w:t>Noise, PLL, PAs, combiners, radar</w:t>
-            </w:r>
-          </w:p>
-        </w:tc>
-      </w:tr>
-      <w:tr>
-        <w:tblPrEx>
-          <w:tblCellMar>
-            <w:top w:w="0" w:type="dxa"/>
-            <w:bottom w:w="0" w:type="dxa"/>
-          </w:tblCellMar>
-        </w:tblPrEx>
-        <w:tc>
-          <w:tcPr>
-            <w:tcW w:w="0" w:type="auto"/>
-          </w:tcPr>
-          <w:p>
-            <w:r>
-              <w:t>7. EMC, Simulation, and Test</w:t>
-            </w:r>
-          </w:p>
-        </w:tc>
-        <w:tc>
-          <w:tcPr>
-            <w:tcW w:w="0" w:type="auto"/>
-          </w:tcPr>
-          <w:p>
-            <w:r>
-              <w:t>Emissions, immunity, solvers, the accredited lab</w:t>
-            </w:r>
-          </w:p>
-        </w:tc>
-      </w:tr>
-      <w:tr>
-        <w:tblPrEx>
-          <w:tblCellMar>
-            <w:top w:w="0" w:type="dxa"/>
-            <w:bottom w:w="0" w:type="dxa"/>
-          </w:tblCellMar>
-        </w:tblPrEx>
-        <w:tc>
-          <w:tcPr>
-            <w:tcW w:w="0" w:type="auto"/>
-          </w:tcPr>
-          <w:p>
-            <w:r>
-              <w:t>8. Power and Energy</w:t>
+              <w:t>6. Power and Energy</w:t>
             </w:r>
           </w:p>
         </w:tc>
@@ -441,7 +385,7 @@
           </w:tcPr>
           <w:p>
             <w:r>
-              <w:t>9. Packaging, Layout, and Emerging</w:t>
+              <w:t>7. Packaging, Layout, EMC, and Test</w:t>
             </w:r>
           </w:p>
         </w:tc>
@@ -451,7 +395,7 @@
           </w:tcPr>
           <w:p>
             <w:r>
-              <w:t>Boards, packages, 2026 compute, robots, MEMS</w:t>
+              <w:t>Boards, packages, cooling, emissions, the accredited lab, robots</w:t>
             </w:r>
           </w:p>
         </w:tc>
@@ -480,7 +424,7 @@
           <w:b/>
           <w:bCs/>
         </w:rPr>
-        <w:t>You do not need the other eight books to use this one. This book is written to stand on Book 1's foundation alone — treat the table as a map of where you have been and where a later interest can take you, not a syllabus you must complete in order.</w:t>
+        <w:t>You do not need the other six books to use this one. This book is written to stand on Book 1's foundation alone — treat the table as a map of where you have been and where a later interest can take you, not a syllabus you must complete in order.</w:t>
       </w:r>
       <w:r/>
     </w:p>
@@ -741,6 +685,38 @@
       </w:pPr>
       <w:r>
         <w:t xml:space="preserve">Chapter 28 — The H-Bridge and Motor as a Plant</w:t>
+      </w:r>
+    </w:p>
+    <w:p>
+      <w:pPr>
+        <w:spacing w:after="200" w:line="276" w:lineRule="auto"/>
+      </w:pPr>
+      <w:r>
+        <w:t xml:space="preserve">Chapter 29 — The Root Locus</w:t>
+      </w:r>
+    </w:p>
+    <w:p>
+      <w:pPr>
+        <w:spacing w:after="200" w:line="276" w:lineRule="auto"/>
+      </w:pPr>
+      <w:r>
+        <w:t xml:space="preserve">Chapter 30 — Stability Margins, Nyquist, and the Sensitivity Peak</w:t>
+      </w:r>
+    </w:p>
+    <w:p>
+      <w:pPr>
+        <w:spacing w:after="200" w:line="276" w:lineRule="auto"/>
+      </w:pPr>
+      <w:r>
+        <w:t xml:space="preserve">Chapter 31 — Oscillators: Feedback That Is Meant to Ring</w:t>
+      </w:r>
+    </w:p>
+    <w:p>
+      <w:pPr>
+        <w:spacing w:after="200" w:line="276" w:lineRule="auto"/>
+      </w:pPr>
+      <w:r>
+        <w:t xml:space="preserve">Chapter 32 — Timing: Setup, Hold, and Metastability</w:t>
       </w:r>
     </w:p>
     <w:p>
@@ -4280,7 +4256,7 @@
           <w:color w:val="000000"/>
           <w:sz w:val="22"/>
         </w:rPr>
-        <w:t>Book 1 already derived inductance from Faraday and Ampere: voltage is L di/dt, and a long solenoid is μ0 N² A / ℓ. This chapter does not derive that again. It sizes a catalog part. Declared air solenoid, 100 turns, 20 mm long, 1 cm² of area: L = 62.8 µH. A ferrite at relative permeability 1000, still linear, would be a thousand times that, 62.8 mH. Saturation current is where the core stops being linear. Self-resonant frequency is where winding capacitance takes over and the part stops acting like an inductor. Line-frequency iron, switch-mode ferrite, pulse transformers, and RF baluns are four shelves in Book 8. They are not this chapter.</w:t>
+        <w:t>Book 1 already derived inductance from Faraday and Ampere: voltage is L di/dt, and a long solenoid is μ0 N² A / ℓ. This chapter does not derive that again. It sizes a catalog part. Declared air solenoid, 100 turns, 20 mm long, 1 cm² of area: L = 62.8 µH. A ferrite at relative permeability 1000, still linear, would be a thousand times that, 62.8 mH. Saturation current is where the core stops being linear. Self-resonant frequency is where winding capacitance takes over and the part stops acting like an inductor. Line-frequency iron, switch-mode ferrite, pulse transformers, and RF baluns are four shelves in Book 6. They are not this chapter.</w:t>
       </w:r>
     </w:p>
     <w:p>
@@ -4654,7 +4630,7 @@
           <w:color w:val="000000"/>
           <w:sz w:val="22"/>
         </w:rPr>
-        <w:t>Book 9 names the 2026 robots and the four layers: general model, task planner, motion tracker, mechanism. This book owns the tracker. It does not repeat the product names or the success percentages.</w:t>
+        <w:t>Book 7 names the 2026 robots and the four layers: general model, task planner, motion tracker, mechanism. This book owns the tracker. It does not repeat the product names or the success percentages.</w:t>
       </w:r>
     </w:p>
     <w:p>
@@ -9201,7 +9177,7 @@
         <w:spacing w:after="200" w:line="276" w:lineRule="auto"/>
       </w:pPr>
       <w:r>
-        <w:t xml:space="preserve">Chapter 9 introduced the real inductor: its core can saturate, its winding has resistance, and its own capacitance gives it a self-resonant frequency. This chapter takes the next step a designer actually faces, which is choosing one particular part from a catalog of thousands. The physics of inductance stays in Book 1, and the design of the converters that use power inductors belongs to Book 8. What lives here is the datasheet: what each number means, which current waveform each one must be checked against, and which numbers are easiest to misread.</w:t>
+        <w:t>Chapter 9 introduced the real inductor: its core can saturate, its winding has resistance, and its own capacitance gives it a self-resonant frequency. This chapter takes the next step a designer actually faces, which is choosing one particular part from a catalog of thousands. The physics of inductance stays in Book 1, and the design of the converters that use power inductors belongs to Book 6. What lives here is the datasheet: what each number means, which current waveform each one must be checked against, and which numbers are easiest to misread.</w:t>
       </w:r>
     </w:p>
     <w:p>
@@ -9265,7 +9241,7 @@
         <w:spacing w:after="200" w:line="276" w:lineRule="auto"/>
       </w:pPr>
       <w:r>
-        <w:t xml:space="preserve">An inductor in a switching circuit carries a DC current with a triangular ripple on top of it. Chapter 9 checked a peak against I_sat; here the ripple comes from the circuit. In a buck regulator, whose full design is the subject of Book 8, the ripple's peak-to-peak value is set by the voltage across the inductor while the switch is on and the time it is on:</w:t>
+        <w:t>An inductor in a switching circuit carries a DC current with a triangular ripple on top of it. Chapter 9 checked a peak against I_sat; here the ripple comes from the circuit. In a buck regulator, whose full design is the subject of Book 6, the ripple's peak-to-peak value is set by the voltage across the inductor while the switch is on and the time it is on:</w:t>
       </w:r>
     </w:p>
     <w:p>
@@ -10794,7 +10770,7 @@
         <w:t xml:space="preserve">Solution: </w:t>
       </w:r>
       <w:r>
-        <w:t xml:space="preserve">ΔV_allowed = 0.03 × 1.0 = 30 mV, so Z_target = 0.030/2 = 15 mΩ. At 10 MHz the 10 µF part presents about 61 mΩ and the 100 nF part about 129 mΩ. Neither comes close; meeting 15 mΩ at 10 MHz takes several capacitors in parallel, each mounted with low inductance, plus the capacitance between the board's power and ground planes. The regulator itself takes care of low frequencies, and the package and die of the load take care of the highest. The very large currents of a modern processor, and the impedance targets they imply, are taken up in Book 9; the method is the same.</w:t>
+        <w:t>ΔV_allowed = 0.03 × 1.0 = 30 mV, so Z_target = 0.030/2 = 15 mΩ. At 10 MHz the 10 µF part presents about 61 mΩ and the 100 nF part about 129 mΩ. Neither comes close; meeting 15 mΩ at 10 MHz takes several capacitors in parallel, each mounted with low inductance, plus the capacitance between the board's power and ground planes. The regulator itself takes care of low frequencies, and the package and die of the load take care of the highest. The very large currents of a modern processor, and the impedance targets they imply, are taken up in Book 7; the method is the same.</w:t>
       </w:r>
     </w:p>
     <w:p>
@@ -11049,7 +11025,7 @@
         <w:t xml:space="preserve">Solution: </w:t>
       </w:r>
       <w:r>
-        <w:t xml:space="preserve">C ≥ 2 × 10×10⁻⁶/0.050 = 400 µF. In practice the ESR also produces an instantaneous drop of I × ESR at the moment of the step; with 20 mΩ of total ESR, that alone would be 40 mV, leaving only 10 mV for the capacitive sag, so the low-ESR requirement can matter as much as the capacitance. Longer hold-up times, such as riding through a lost input supply, are a power-system question and belong to Book 8.</w:t>
+        <w:t>C ≥ 2 × 10×10⁻⁶/0.050 = 400 µF. In practice the ESR also produces an instantaneous drop of I × ESR at the moment of the step; with 20 mΩ of total ESR, that alone would be 40 mV, leaving only 10 mV for the capacitive sag, so the low-ESR requirement can matter as much as the capacitance. Longer hold-up times, such as riding through a lost input supply, are a power-system question and belong to Book 6.</w:t>
       </w:r>
     </w:p>
     <w:p>
@@ -14096,6 +14072,1702 @@
       </w:pPr>
       <w:r>
         <w:t xml:space="preserve">Explain in a sentence or two why a brake chopper is unnecessary when the drive runs from a battery but essential on a rectified mains supply.</w:t>
+      </w:r>
+    </w:p>
+    <w:p>
+      <w:pPr>
+        <w:pStyle w:val="Heading1"/>
+        <w:pageBreakBefore/>
+        <w:spacing w:before="480" w:after="240"/>
+      </w:pPr>
+      <w:r>
+        <w:t xml:space="preserve">Chapter 29 — The Root Locus</w:t>
+      </w:r>
+    </w:p>
+    <w:p>
+      <w:pPr>
+        <w:spacing w:after="200" w:line="276" w:lineRule="auto"/>
+      </w:pPr>
+      <w:r>
+        <w:t xml:space="preserve">Chapters 17 and 18 designed loops by choosing gains and checking the result. The root locus shows, in one picture, where every closed-loop pole goes as one gain is raised from zero to infinity. It was introduced by Walter Evans in 1948 and remains the quickest way to see whether a loop can be made fast and well damped by gain alone, or whether it needs the lead, lag, or PID shaping of Chapter 18. This chapter states the rules that sketch the locus and uses them on two plants whose numbers recur in the next chapter.</w:t>
+      </w:r>
+    </w:p>
+    <w:p>
+      <w:pPr>
+        <w:pStyle w:val="Heading2"/>
+        <w:spacing w:before="360" w:after="160"/>
+      </w:pPr>
+      <w:r>
+        <w:t xml:space="preserve">29.1 The Characteristic Equation</w:t>
+      </w:r>
+    </w:p>
+    <w:p>
+      <w:pPr>
+        <w:spacing w:after="200" w:line="276" w:lineRule="auto"/>
+      </w:pPr>
+      <w:r>
+        <w:t xml:space="preserve">With a controller gain K in series with a plant G(s) and unity feedback, the closed-loop transfer function is KG/(1 + KG). Its poles are the roots of 1 + KG(s) = 0. Writing G(s) = N(s)/D(s), the poles satisfy D(s) + K N(s) = 0. At K = 0 they are the open-loop poles, the roots of D. As K grows they move, and as K → ∞ they approach the open-loop zeros, the roots of N, or go off to infinity along straight lines. The locus is the set of all points the poles can occupy.</w:t>
+      </w:r>
+    </w:p>
+    <w:p>
+      <w:pPr>
+        <w:spacing w:before="200" w:after="200"/>
+        <w:jc w:val="center"/>
+      </w:pPr>
+      <w:r>
+        <w:t xml:space="preserve">1 + K G(s) = 0  ⇔  D(s) + K N(s) = 0</w:t>
+      </w:r>
+    </w:p>
+    <w:p>
+      <w:pPr>
+        <w:spacing w:after="200" w:line="276" w:lineRule="auto"/>
+      </w:pPr>
+      <w:r>
+        <w:t xml:space="preserve">A point s lies on the locus if the angle of G(s) is 180° (an odd multiple of it). The gain that places a pole there is then K = 1/|G(s)|. Those two conditions, angle and magnitude, are all the rules below encode.</w:t>
+      </w:r>
+    </w:p>
+    <w:p>
+      <w:pPr>
+        <w:pStyle w:val="Heading2"/>
+        <w:spacing w:before="360" w:after="160"/>
+      </w:pPr>
+      <w:r>
+        <w:t xml:space="preserve">29.2 Sketching Rules</w:t>
+      </w:r>
+    </w:p>
+    <w:p>
+      <w:pPr>
+        <w:spacing w:after="200" w:line="276" w:lineRule="auto"/>
+      </w:pPr>
+      <w:r>
+        <w:t xml:space="preserve">Five rules give a sketch good enough for design. First, the locus has as many branches as the plant has poles, starting at the poles and ending at the zeros or at infinity. Second, on the real axis the locus lies to the left of an odd number of real poles and zeros. Third, the branches that go to infinity follow asymptotes at angles (2k + 1)180°/(n − m), where n and m are the numbers of poles and zeros, and the asymptotes meet at the centroid σ = (Σ poles − Σ zeros)/(n − m). Fourth, where two branches meet on the real axis and leave it, the breakaway point is a root of dK/ds = 0. Fifth, the crossing of the imaginary axis, if any, is found from the Routh array of Chapter 17 or by substituting s = jω.</w:t>
+      </w:r>
+    </w:p>
+    <w:p>
+      <w:pPr>
+        <w:spacing w:before="200" w:after="200"/>
+        <w:jc w:val="center"/>
+      </w:pPr>
+      <w:r>
+        <w:t xml:space="preserve">asymptote angles = (2k + 1)·180°/(n − m),   σ = (Σp − Σz)/(n − m)</w:t>
+      </w:r>
+    </w:p>
+    <w:p>
+      <w:pPr>
+        <w:spacing w:before="200" w:after="80"/>
+      </w:pPr>
+      <w:r>
+        <w:rPr>
+          <w:b/>
+          <w:bCs/>
+        </w:rPr>
+        <w:t xml:space="preserve">Worked Example 29.1</w:t>
+      </w:r>
+    </w:p>
+    <w:p>
+      <w:pPr>
+        <w:shd w:val="clear" w:color="auto" w:fill="E8F0E8"/>
+        <w:spacing w:after="80"/>
+      </w:pPr>
+      <w:r>
+        <w:rPr>
+          <w:b/>
+          <w:bCs/>
+        </w:rPr>
+        <w:t xml:space="preserve">Problem: </w:t>
+      </w:r>
+      <w:r>
+        <w:t xml:space="preserve">A position loop has the plant G(s) = 1/(s(s + 4)). Sketch the locus, find the gain at the breakaway point, and find K for a damping ratio of 0.707.</w:t>
+      </w:r>
+    </w:p>
+    <w:p>
+      <w:pPr>
+        <w:shd w:val="clear" w:color="auto" w:fill="E8F0E8"/>
+        <w:spacing w:after="200"/>
+      </w:pPr>
+      <w:r>
+        <w:rPr>
+          <w:b/>
+          <w:bCs/>
+        </w:rPr>
+        <w:t xml:space="preserve">Solution: </w:t>
+      </w:r>
+      <w:r>
+        <w:t xml:space="preserve">The characteristic equation is s² + 4s + K = 0. At K = 0 the poles are at 0 and −4; on the real axis the locus lies between them. They meet at s = −2 when K = 4 and then leave the axis vertically, along the line Re(s) = −2, since the sum of the roots is fixed at −4. For ζ = 0.707, 2ζω_n = 4 gives ω_n = 2.83 rad/s and K = ω_n² = 8. The overshoot is 4.3% and the 2% settling time 4/(ζω_n) = 2 s. No gain makes it settle faster than 2 s, because the real part of the poles cannot pass −2: speed must come from shaping, not from gain.</w:t>
+      </w:r>
+    </w:p>
+    <w:p>
+      <w:pPr>
+        <w:pStyle w:val="Heading2"/>
+        <w:spacing w:before="360" w:after="160"/>
+      </w:pPr>
+      <w:r>
+        <w:t xml:space="preserve">29.3 A Third Pole</w:t>
+      </w:r>
+    </w:p>
+    <w:p>
+      <w:pPr>
+        <w:spacing w:after="200" w:line="276" w:lineRule="auto"/>
+      </w:pPr>
+      <w:r>
+        <w:t xml:space="preserve">Most real plants have more poles than the two of a textbook motor, and the third pole changes the picture: with three poles and no zeros, the asymptotes leave at ±60°, and the two dominant branches eventually cross into the right half-plane. There is now a largest stable gain, and the useful range of gain lies well below it.</w:t>
+      </w:r>
+    </w:p>
+    <w:p>
+      <w:pPr>
+        <w:spacing w:before="200" w:after="80"/>
+      </w:pPr>
+      <w:r>
+        <w:rPr>
+          <w:b/>
+          <w:bCs/>
+        </w:rPr>
+        <w:t xml:space="preserve">Worked Example 29.2</w:t>
+      </w:r>
+    </w:p>
+    <w:p>
+      <w:pPr>
+        <w:shd w:val="clear" w:color="auto" w:fill="E8F0E8"/>
+        <w:spacing w:after="80"/>
+      </w:pPr>
+      <w:r>
+        <w:rPr>
+          <w:b/>
+          <w:bCs/>
+        </w:rPr>
+        <w:t xml:space="preserve">Problem: </w:t>
+      </w:r>
+      <w:r>
+        <w:t xml:space="preserve">For G(s) = 1/(s(s + 2)(s + 10)), find the asymptotes, the breakaway point, the gain at which the loop becomes unstable, and the frequency of oscillation there.</w:t>
+      </w:r>
+    </w:p>
+    <w:p>
+      <w:pPr>
+        <w:shd w:val="clear" w:color="auto" w:fill="E8F0E8"/>
+        <w:spacing w:after="200"/>
+      </w:pPr>
+      <w:r>
+        <w:rPr>
+          <w:b/>
+          <w:bCs/>
+        </w:rPr>
+        <w:t xml:space="preserve">Solution: </w:t>
+      </w:r>
+      <w:r>
+        <w:t xml:space="preserve">There are three poles and no zeros, so the asymptotes are at ±60° and 180°, meeting at σ = (0 − 2 − 10)/3 = −4. The real-axis locus lies between 0 and −2 and to the left of −10. The breakaway point solves d/ds[s(s + 2)(s + 10)] = 3s² + 24s + 20 = 0, giving s = −0.945 (the other root, −7.06, is not on the locus), with K = 0.945 × 1.055 × 9.055 = 9.03. The characteristic polynomial is s³ + 12s² + 20s + K. The Routh array's s¹ entry is (240 − K)/12, which vanishes at K = 240, and the auxiliary equation 12s² + 240 = 0 gives s = ±j4.47 rad/s. Above K = 240 the loop oscillates and grows.</w:t>
+      </w:r>
+    </w:p>
+    <w:p>
+      <w:pPr>
+        <w:spacing w:before="200" w:after="60"/>
+        <w:jc w:val="center"/>
+      </w:pPr>
+      <w:r>
+        <w:drawing>
+          <wp:inline xmlns:a="http://schemas.openxmlformats.org/drawingml/2006/main" xmlns:pic="http://schemas.openxmlformats.org/drawingml/2006/picture">
+            <wp:extent cx="4379976" cy="2481986"/>
+            <wp:docPr id="2126307776" name="Picture 2126307776"/>
+            <wp:cNvGraphicFramePr>
+              <a:graphicFrameLocks noChangeAspect="1"/>
+            </wp:cNvGraphicFramePr>
+            <a:graphic>
+              <a:graphicData uri="http://schemas.openxmlformats.org/drawingml/2006/picture">
+                <pic:pic>
+                  <pic:nvPicPr>
+                    <pic:cNvPr id="0" name="fig29_1.png"/>
+                    <pic:cNvPicPr/>
+                  </pic:nvPicPr>
+                  <pic:blipFill>
+                    <a:blip r:embed="rId37"/>
+                    <a:stretch>
+                      <a:fillRect/>
+                    </a:stretch>
+                  </pic:blipFill>
+                  <pic:spPr>
+                    <a:xfrm>
+                      <a:off x="0" y="0"/>
+                      <a:ext cx="4379976" cy="2481986"/>
+                    </a:xfrm>
+                    <a:prstGeom prst="rect"/>
+                  </pic:spPr>
+                </pic:pic>
+              </a:graphicData>
+            </a:graphic>
+          </wp:inline>
+        </w:drawing>
+      </w:r>
+    </w:p>
+    <w:p>
+      <w:pPr>
+        <w:spacing w:after="200"/>
+        <w:jc w:val="center"/>
+      </w:pPr>
+      <w:r>
+        <w:rPr>
+          <w:i/>
+          <w:iCs/>
+          <w:color w:val="555555"/>
+          <w:sz w:val="19"/>
+          <w:szCs w:val="19"/>
+        </w:rPr>
+        <w:t xml:space="preserve">Figure 29.1 — Root locus of G(s) = 1/(s(s + 2)(s + 10)), with the breakaway at −0.945, the asymptotes from σ = −4, the ζ = 0.5 operating point at K ≈ 28.7, and the imaginary-axis crossing at K = 240.</w:t>
+      </w:r>
+    </w:p>
+    <w:p>
+      <w:pPr>
+        <w:spacing w:before="200" w:after="80"/>
+      </w:pPr>
+      <w:r>
+        <w:rPr>
+          <w:b/>
+          <w:bCs/>
+        </w:rPr>
+        <w:t xml:space="preserve">Worked Example 29.3</w:t>
+      </w:r>
+    </w:p>
+    <w:p>
+      <w:pPr>
+        <w:shd w:val="clear" w:color="auto" w:fill="E8F0E8"/>
+        <w:spacing w:after="80"/>
+      </w:pPr>
+      <w:r>
+        <w:rPr>
+          <w:b/>
+          <w:bCs/>
+        </w:rPr>
+        <w:t xml:space="preserve">Problem: </w:t>
+      </w:r>
+      <w:r>
+        <w:t xml:space="preserve">For the same plant, find the gain that gives the dominant poles a damping ratio of 0.5, and check that the third pole is far enough away to be ignored.</w:t>
+      </w:r>
+    </w:p>
+    <w:p>
+      <w:pPr>
+        <w:shd w:val="clear" w:color="auto" w:fill="E8F0E8"/>
+        <w:spacing w:after="200"/>
+      </w:pPr>
+      <w:r>
+        <w:rPr>
+          <w:b/>
+          <w:bCs/>
+        </w:rPr>
+        <w:t xml:space="preserve">Solution: </w:t>
+      </w:r>
+      <w:r>
+        <w:t xml:space="preserve">Searching along the ζ = 0.5 line, where the poles are at angles of 120° from the positive real axis, the angle condition is met at s = −0.833 ± j1.443, so ω_n = 1.67 rad/s, and the magnitude condition gives K = 28.7. The third root is at −10.33, more than twelve times further from the origin than the real part of the dominant pair, so the step response is very nearly second order: about 16% overshoot and a settling time of 4/0.833 = 4.8 s. The gain margin at this K is 240/28.7 = 8.4, or 18.4 dB, a number Chapter 30 will return to.</w:t>
+      </w:r>
+    </w:p>
+    <w:p>
+      <w:pPr>
+        <w:shd w:val="clear" w:color="auto" w:fill="EFEFEF"/>
+        <w:spacing w:before="120" w:after="80"/>
+      </w:pPr>
+      <w:r>
+        <w:rPr>
+          <w:b/>
+          <w:bCs/>
+        </w:rPr>
+        <w:t xml:space="preserve">Key Idea</w:t>
+      </w:r>
+    </w:p>
+    <w:p>
+      <w:pPr>
+        <w:shd w:val="clear" w:color="auto" w:fill="EFEFEF"/>
+        <w:spacing w:after="120"/>
+      </w:pPr>
+      <w:r>
+        <w:rPr>
+          <w:b/>
+          <w:bCs/>
+        </w:rPr>
+        <w:t xml:space="preserve">The locus shows what gain can and cannot do. </w:t>
+      </w:r>
+      <w:r>
+        <w:t xml:space="preserve">If the desired closed-loop poles lie on the locus, a gain alone achieves them; if they do not, a zero from lead or PD control must bend the locus toward them, and a pole from lag or PI control near the origin improves accuracy without moving the locus much elsewhere.</w:t>
+      </w:r>
+    </w:p>
+    <w:p>
+      <w:pPr>
+        <w:pStyle w:val="Heading2"/>
+        <w:spacing w:before="360" w:after="160"/>
+      </w:pPr>
+      <w:r>
+        <w:t xml:space="preserve">29.4 Bending the Locus</w:t>
+      </w:r>
+    </w:p>
+    <w:p>
+      <w:pPr>
+        <w:spacing w:after="200" w:line="276" w:lineRule="auto"/>
+      </w:pPr>
+      <w:r>
+        <w:t xml:space="preserve">Adding a zero pulls the locus toward it. A lead compensator places a zero closer to the origin than its pole, so the net effect near the dominant poles is a zero, and the asymptotes move left. In the plant of Worked Example 29.2, a compensator zero at −2 cancels the pole there, leaving the poles at 0 and −10 and the compensator's own pole, placed here at −20; the dominant branches then break away at −4.23, the root of 3s² + 60s + 200 = 0, instead of −0.945 and the settling time can fall several-fold. A lag compensator places a pole and zero close together near the origin, which leaves the locus almost unchanged but raises the low-frequency gain, reducing the steady-state error of Chapter 17. These are the same compensators Chapter 18 introduced through the Bode plot, now seen through the poles they move.</w:t>
+      </w:r>
+    </w:p>
+    <w:p>
+      <w:pPr>
+        <w:shd w:val="clear" w:color="auto" w:fill="FCEEEA"/>
+        <w:spacing w:before="120" w:after="80"/>
+      </w:pPr>
+      <w:r>
+        <w:rPr>
+          <w:b/>
+          <w:bCs/>
+        </w:rPr>
+        <w:t xml:space="preserve">Common Misconception</w:t>
+      </w:r>
+    </w:p>
+    <w:p>
+      <w:pPr>
+        <w:shd w:val="clear" w:color="auto" w:fill="FCEEEA"/>
+        <w:spacing w:after="120"/>
+      </w:pPr>
+      <w:r>
+        <w:t xml:space="preserve">Cancelling a plant pole with a compensator zero does not remove the pole from the system. The cancelled pole still governs how the plant responds to disturbances that enter at its input, and an exact cancellation is never achieved in practice. Cancelling a slow, stable pole is common and safe; cancelling an unstable or lightly damped one is not, because the hidden mode remains and grows or rings.</w:t>
+      </w:r>
+    </w:p>
+    <w:p>
+      <w:pPr>
+        <w:pStyle w:val="ListParagraph"/>
+        <w:numPr>
+          <w:ilvl w:val="0"/>
+          <w:numId w:val="29"/>
+        </w:numPr>
+        <w:spacing w:after="100"/>
+      </w:pPr>
+      <w:r>
+        <w:t xml:space="preserve">For G(s) = 1/(s(s + 6)), find the gain that gives ζ = 0.707.</w:t>
+      </w:r>
+    </w:p>
+    <w:p>
+      <w:pPr>
+        <w:pStyle w:val="ListParagraph"/>
+        <w:numPr>
+          <w:ilvl w:val="0"/>
+          <w:numId w:val="29"/>
+        </w:numPr>
+        <w:spacing w:after="100"/>
+      </w:pPr>
+      <w:r>
+        <w:t xml:space="preserve">For the same plant, find the breakaway point and the gain there.</w:t>
+      </w:r>
+    </w:p>
+    <w:p>
+      <w:pPr>
+        <w:pStyle w:val="ListParagraph"/>
+        <w:numPr>
+          <w:ilvl w:val="0"/>
+          <w:numId w:val="29"/>
+        </w:numPr>
+        <w:spacing w:after="100"/>
+      </w:pPr>
+      <w:r>
+        <w:t xml:space="preserve">Find the asymptote centroid and angles for G(s) = 1/(s(s + 1)(s + 5)).</w:t>
+      </w:r>
+    </w:p>
+    <w:p>
+      <w:pPr>
+        <w:pStyle w:val="ListParagraph"/>
+        <w:numPr>
+          <w:ilvl w:val="0"/>
+          <w:numId w:val="29"/>
+        </w:numPr>
+        <w:spacing w:after="100"/>
+      </w:pPr>
+      <w:r>
+        <w:t xml:space="preserve">Find the gain and frequency at which the loop of the previous problem becomes unstable.</w:t>
+      </w:r>
+    </w:p>
+    <w:p>
+      <w:pPr>
+        <w:pStyle w:val="ListParagraph"/>
+        <w:numPr>
+          <w:ilvl w:val="0"/>
+          <w:numId w:val="29"/>
+        </w:numPr>
+        <w:spacing w:after="100"/>
+      </w:pPr>
+      <w:r>
+        <w:t xml:space="preserve">What overshoot does a second-order system with ζ = 0.5 have?</w:t>
+      </w:r>
+    </w:p>
+    <w:p>
+      <w:pPr>
+        <w:pStyle w:val="ListParagraph"/>
+        <w:numPr>
+          <w:ilvl w:val="0"/>
+          <w:numId w:val="29"/>
+        </w:numPr>
+        <w:spacing w:after="100"/>
+      </w:pPr>
+      <w:r>
+        <w:t xml:space="preserve">On what parts of the real axis does the locus of G(s) = 1/(s(s + 2)(s + 10)) lie?</w:t>
+      </w:r>
+    </w:p>
+    <w:p>
+      <w:pPr>
+        <w:pStyle w:val="Heading1"/>
+        <w:pageBreakBefore/>
+        <w:spacing w:before="480" w:after="240"/>
+      </w:pPr>
+      <w:r>
+        <w:t xml:space="preserve">Chapter 30 — Stability Margins, Nyquist, and the Sensitivity Peak</w:t>
+      </w:r>
+    </w:p>
+    <w:p>
+      <w:pPr>
+        <w:spacing w:after="200" w:line="276" w:lineRule="auto"/>
+      </w:pPr>
+      <w:r>
+        <w:t xml:space="preserve">The root locus of Chapter 29 asks where the poles are. The frequency-response view asks how close the loop is to becoming unstable, and that question has a practical edge: the plant on the bench is never exactly the model, so the designer needs to know how much error the loop can absorb. Gain margin, phase margin, delay margin, and the peak of the sensitivity function are four answers. This chapter defines them, connects them through the Nyquist criterion, and computes them for the plant of Chapter 29, following the treatment in Åström and Murray.</w:t>
+      </w:r>
+    </w:p>
+    <w:p>
+      <w:pPr>
+        <w:pStyle w:val="Heading2"/>
+        <w:spacing w:before="360" w:after="160"/>
+      </w:pPr>
+      <w:r>
+        <w:t xml:space="preserve">30.1 The Nyquist Criterion in Words</w:t>
+      </w:r>
+    </w:p>
+    <w:p>
+      <w:pPr>
+        <w:spacing w:after="200" w:line="276" w:lineRule="auto"/>
+      </w:pPr>
+      <w:r>
+        <w:t xml:space="preserve">Plot the loop transfer function L(jω) = KG(jω) as ω runs from −∞ to +∞; the curve is the Nyquist plot. The closed loop 1/(1 + L) has a pole wherever L = −1, so the point −1 is critical. Nyquist's theorem counts: the number of unstable closed-loop poles Z equals the number of clockwise encirclements N of −1 plus the number of unstable open-loop poles P. For the usual stable plant, P = 0, and the loop is stable exactly when the curve does not encircle −1. For an unstable plant, such as an inverted pendulum, the curve must encircle −1 counterclockwise once for each unstable pole.</w:t>
+      </w:r>
+    </w:p>
+    <w:p>
+      <w:pPr>
+        <w:spacing w:before="200" w:after="200"/>
+        <w:jc w:val="center"/>
+      </w:pPr>
+      <w:r>
+        <w:t xml:space="preserve">Z = N + P   (closed-loop RHP poles = clockwise encirclements of −1 + open-loop RHP poles)</w:t>
+      </w:r>
+    </w:p>
+    <w:p>
+      <w:pPr>
+        <w:spacing w:after="200" w:line="276" w:lineRule="auto"/>
+      </w:pPr>
+      <w:r>
+        <w:t xml:space="preserve">The theorem's practical value is that it works from measured frequency response. A loop whose model is uncertain but whose L(jω) has been measured with a network analyzer, as Chapter 13 measured op-amp loops, can be judged without ever writing its poles.</w:t>
+      </w:r>
+    </w:p>
+    <w:p>
+      <w:pPr>
+        <w:pStyle w:val="Heading2"/>
+        <w:spacing w:before="360" w:after="160"/>
+      </w:pPr>
+      <w:r>
+        <w:t xml:space="preserve">30.2 Gain, Phase, and Delay Margins</w:t>
+      </w:r>
+    </w:p>
+    <w:p>
+      <w:pPr>
+        <w:spacing w:after="200" w:line="276" w:lineRule="auto"/>
+      </w:pPr>
+      <w:r>
+        <w:t xml:space="preserve">The gain margin is the factor by which the gain could rise before the curve passes through −1; it is read at the phase-crossover frequency, where the phase is −180°. The phase margin is the extra phase lag that would bring the curve through −1 at the gain-crossover frequency ω_c, where |L| = 1. Because a pure time delay τ adds phase lag ωτ without changing the gain, the phase margin also sets how much unmodeled delay the loop can tolerate: the delay margin is the phase margin in radians divided by ω_c.</w:t>
+      </w:r>
+    </w:p>
+    <w:p>
+      <w:pPr>
+        <w:spacing w:before="200" w:after="200"/>
+        <w:jc w:val="center"/>
+      </w:pPr>
+      <w:r>
+        <w:t xml:space="preserve">GM = 1/|L(jω₁₈₀)|,   PM = 180° + ∠L(jω_c),   τ_max = PM(rad)/ω_c</w:t>
+      </w:r>
+    </w:p>
+    <w:p>
+      <w:pPr>
+        <w:spacing w:before="200" w:after="80"/>
+      </w:pPr>
+      <w:r>
+        <w:rPr>
+          <w:b/>
+          <w:bCs/>
+        </w:rPr>
+        <w:t xml:space="preserve">Worked Example 30.1</w:t>
+      </w:r>
+    </w:p>
+    <w:p>
+      <w:pPr>
+        <w:shd w:val="clear" w:color="auto" w:fill="E8F0E8"/>
+        <w:spacing w:after="80"/>
+      </w:pPr>
+      <w:r>
+        <w:rPr>
+          <w:b/>
+          <w:bCs/>
+        </w:rPr>
+        <w:t xml:space="preserve">Problem: </w:t>
+      </w:r>
+      <w:r>
+        <w:t xml:space="preserve">For L(s) = K/(s(s + 2)(s + 10)), find the gain margin, crossover frequency, phase margin, and delay margin for K = 28.7, the ζ = 0.5 gain of Chapter 29, and for K = 60.</w:t>
+      </w:r>
+    </w:p>
+    <w:p>
+      <w:pPr>
+        <w:shd w:val="clear" w:color="auto" w:fill="E8F0E8"/>
+        <w:spacing w:after="200"/>
+      </w:pPr>
+      <w:r>
+        <w:rPr>
+          <w:b/>
+          <w:bCs/>
+        </w:rPr>
+        <w:t xml:space="preserve">Solution: </w:t>
+      </w:r>
+      <w:r>
+        <w:t xml:space="preserve">The phase reaches −180° at ω = √20 = 4.47 rad/s, where |s(s + 2)(s + 10)| = 240, so GM = 240/K. For K = 28.7, GM = 8.4 (18.4 dB); |L| = 1 at ω_c = 1.22 rad/s, where the phase is −128.3°, so PM = 51.7°, and the delay margin is 0.903 rad/1.22 rad/s = 0.74 s. For K = 60, GM = 4.0 (12.0 dB), ω_c = 2.05 rad/s, PM = 32.7°, and the delay margin falls to 0.28 s. Doubling the gain made the loop about 1.7 times faster at crossover but cut its tolerance to delay by a factor of 2.7.</w:t>
+      </w:r>
+    </w:p>
+    <w:p>
+      <w:pPr>
+        <w:pStyle w:val="Heading2"/>
+        <w:spacing w:before="360" w:after="160"/>
+      </w:pPr>
+      <w:r>
+        <w:t xml:space="preserve">30.3 The Sensitivity Function</w:t>
+      </w:r>
+    </w:p>
+    <w:p>
+      <w:pPr>
+        <w:spacing w:after="200" w:line="276" w:lineRule="auto"/>
+      </w:pPr>
+      <w:r>
+        <w:t xml:space="preserve">The sensitivity function S = 1/(1 + L) tells how much the loop reduces disturbances and plant variations at each frequency: where |S| &lt; 1, feedback helps; where |S| &gt; 1, it amplifies. Its peak, M_s, is the inverse of the shortest distance from the Nyquist curve to −1, so it is a single number that captures both margins at once. Bode's integral shows that the area of ln|S| over frequency is zero for most stable loops, so pushing the sensitivity down at low frequency must push it up somewhere else, a fact sometimes called the waterbed effect.</w:t>
+      </w:r>
+    </w:p>
+    <w:p>
+      <w:pPr>
+        <w:spacing w:before="200" w:after="200"/>
+        <w:jc w:val="center"/>
+      </w:pPr>
+      <w:r>
+        <w:t xml:space="preserve">S = 1/(1 + L),   M_s = max|S(jω)| = 1/min|1 + L(jω)|</w:t>
+      </w:r>
+    </w:p>
+    <w:p>
+      <w:pPr>
+        <w:spacing w:after="200" w:line="276" w:lineRule="auto"/>
+      </w:pPr>
+      <w:r>
+        <w:t xml:space="preserve">A bound on M_s guarantees both margins. If the curve stays at least 1/M_s from −1, then GM ≥ M_s/(M_s − 1) and PM ≥ 2 arcsin(1/(2M_s)). Åström and Murray recommend M_s between about 1.2 and 2 for most designs.</w:t>
+      </w:r>
+    </w:p>
+    <w:p>
+      <w:pPr>
+        <w:spacing w:before="200" w:after="80"/>
+      </w:pPr>
+      <w:r>
+        <w:rPr>
+          <w:b/>
+          <w:bCs/>
+        </w:rPr>
+        <w:t xml:space="preserve">Worked Example 30.2</w:t>
+      </w:r>
+    </w:p>
+    <w:p>
+      <w:pPr>
+        <w:shd w:val="clear" w:color="auto" w:fill="E8F0E8"/>
+        <w:spacing w:after="80"/>
+      </w:pPr>
+      <w:r>
+        <w:rPr>
+          <w:b/>
+          <w:bCs/>
+        </w:rPr>
+        <w:t xml:space="preserve">Problem: </w:t>
+      </w:r>
+      <w:r>
+        <w:t xml:space="preserve">Find M_s for the loop of Worked Example 30.1 at K = 28.7, 60, and 120, and the margins it guarantees for M_s = 2.</w:t>
+      </w:r>
+    </w:p>
+    <w:p>
+      <w:pPr>
+        <w:shd w:val="clear" w:color="auto" w:fill="E8F0E8"/>
+        <w:spacing w:after="200"/>
+      </w:pPr>
+      <w:r>
+        <w:rPr>
+          <w:b/>
+          <w:bCs/>
+        </w:rPr>
+        <w:t xml:space="preserve">Solution: </w:t>
+      </w:r>
+      <w:r>
+        <w:t xml:space="preserve">Computing |1/(1 + L(jω))| over frequency gives M_s = 1.55 at K = 28.7, 2.20 at K = 60, and 4.21 at K = 120. For M_s = 2, the guaranteed margins are GM ≥ 2 (6.0 dB) and PM ≥ 29.0°. The K = 28.7 design, with M_s = 1.55, guarantees GM ≥ 2.82 (9.0 dB) and PM ≥ 37.6°; its actual margins of 18.4 dB and 51.7° are better than the bound, as they must be. At K = 120, an M_s of 4.2 means that a disturbance near 3 rad/s is amplified four times: the loop is still stable, with a 6 dB gain margin, but it is no longer doing its job near crossover.</w:t>
+      </w:r>
+    </w:p>
+    <w:p>
+      <w:pPr>
+        <w:spacing w:before="200" w:after="60"/>
+        <w:jc w:val="center"/>
+      </w:pPr>
+      <w:r>
+        <w:drawing>
+          <wp:inline xmlns:a="http://schemas.openxmlformats.org/drawingml/2006/main" xmlns:pic="http://schemas.openxmlformats.org/drawingml/2006/picture">
+            <wp:extent cx="4379976" cy="2116988"/>
+            <wp:docPr id="2126307777" name="Picture 2126307777"/>
+            <wp:cNvGraphicFramePr>
+              <a:graphicFrameLocks noChangeAspect="1"/>
+            </wp:cNvGraphicFramePr>
+            <a:graphic>
+              <a:graphicData uri="http://schemas.openxmlformats.org/drawingml/2006/picture">
+                <pic:pic>
+                  <pic:nvPicPr>
+                    <pic:cNvPr id="0" name="fig30_1.png"/>
+                    <pic:cNvPicPr/>
+                  </pic:nvPicPr>
+                  <pic:blipFill>
+                    <a:blip r:embed="rId38"/>
+                    <a:stretch>
+                      <a:fillRect/>
+                    </a:stretch>
+                  </pic:blipFill>
+                  <pic:spPr>
+                    <a:xfrm>
+                      <a:off x="0" y="0"/>
+                      <a:ext cx="4379976" cy="2116988"/>
+                    </a:xfrm>
+                    <a:prstGeom prst="rect"/>
+                  </pic:spPr>
+                </pic:pic>
+              </a:graphicData>
+            </a:graphic>
+          </wp:inline>
+        </w:drawing>
+      </w:r>
+    </w:p>
+    <w:p>
+      <w:pPr>
+        <w:spacing w:after="200"/>
+        <w:jc w:val="center"/>
+      </w:pPr>
+      <w:r>
+        <w:rPr>
+          <w:i/>
+          <w:iCs/>
+          <w:color w:val="555555"/>
+          <w:sz w:val="19"/>
+          <w:szCs w:val="19"/>
+        </w:rPr>
+        <w:t xml:space="preserve">Figure 30.1 — Sensitivity magnitude |S(jω)| for L = K/(s(s + 2)(s + 10)) at K = 28.7, 60, and 120. The peaks M_s = 1.55, 2.20, and 4.21 lie near crossover; all three curves are below 1 at low frequency.</w:t>
+      </w:r>
+    </w:p>
+    <w:p>
+      <w:pPr>
+        <w:shd w:val="clear" w:color="auto" w:fill="EFEFEF"/>
+        <w:spacing w:before="120" w:after="80"/>
+      </w:pPr>
+      <w:r>
+        <w:rPr>
+          <w:b/>
+          <w:bCs/>
+        </w:rPr>
+        <w:t xml:space="preserve">Key Idea</w:t>
+      </w:r>
+    </w:p>
+    <w:p>
+      <w:pPr>
+        <w:shd w:val="clear" w:color="auto" w:fill="EFEFEF"/>
+        <w:spacing w:after="120"/>
+      </w:pPr>
+      <w:r>
+        <w:rPr>
+          <w:b/>
+          <w:bCs/>
+        </w:rPr>
+        <w:t xml:space="preserve">The sensitivity peak is the margin that matters. </w:t>
+      </w:r>
+      <w:r>
+        <w:t xml:space="preserve">Gain and phase margins each test one direction of error; M_s, the inverse of the closest approach of the Nyquist curve to −1, bounds both and also measures how much the loop amplifies disturbances near crossover.</w:t>
+      </w:r>
+    </w:p>
+    <w:p>
+      <w:pPr>
+        <w:pStyle w:val="Heading2"/>
+        <w:spacing w:before="360" w:after="160"/>
+      </w:pPr>
+      <w:r>
+        <w:t xml:space="preserve">30.4 Delay in Digital Loops</w:t>
+      </w:r>
+    </w:p>
+    <w:p>
+      <w:pPr>
+        <w:spacing w:after="200" w:line="276" w:lineRule="auto"/>
+      </w:pPr>
+      <w:r>
+        <w:t xml:space="preserve">Chapter 19 showed that a sampled controller adds about 1.5 sample periods of delay. The delay margin turns that into a design rule: the loop's phase margin, in radians, divided by its crossover frequency must exceed the total delay of sampling, computation, filtering, and the actuator, with room to spare. A loop with 45° of phase margin at 10 rad/s tolerates 79 ms of delay; at 100 rad/s it tolerates 7.9 ms. The faster the loop, the faster the sample rate it needs, which is why the current loop of Chapter 28 runs at the switching frequency and the speed loop above it can run slower.</w:t>
+      </w:r>
+    </w:p>
+    <w:p>
+      <w:pPr>
+        <w:shd w:val="clear" w:color="auto" w:fill="FCEEEA"/>
+        <w:spacing w:before="120" w:after="80"/>
+      </w:pPr>
+      <w:r>
+        <w:rPr>
+          <w:b/>
+          <w:bCs/>
+        </w:rPr>
+        <w:t xml:space="preserve">Common Misconception</w:t>
+      </w:r>
+    </w:p>
+    <w:p>
+      <w:pPr>
+        <w:shd w:val="clear" w:color="auto" w:fill="FCEEEA"/>
+        <w:spacing w:after="120"/>
+      </w:pPr>
+      <w:r>
+        <w:t xml:space="preserve">A large gain margin does not by itself mean a robust loop. A loop can have a gain margin of 20 dB and still pass close to −1 at some other frequency, with a small phase margin or a large M_s, especially when the plant has lightly damped resonances. Always look at the closest approach to −1, not only at the two crossover frequencies.</w:t>
+      </w:r>
+    </w:p>
+    <w:p>
+      <w:pPr>
+        <w:pStyle w:val="ListParagraph"/>
+        <w:numPr>
+          <w:ilvl w:val="0"/>
+          <w:numId w:val="30"/>
+        </w:numPr>
+        <w:spacing w:after="100"/>
+      </w:pPr>
+      <w:r>
+        <w:t xml:space="preserve">What do Z, N, and P stand for in the Nyquist relation, and what must hold for a stable plant?</w:t>
+      </w:r>
+    </w:p>
+    <w:p>
+      <w:pPr>
+        <w:pStyle w:val="ListParagraph"/>
+        <w:numPr>
+          <w:ilvl w:val="0"/>
+          <w:numId w:val="30"/>
+        </w:numPr>
+        <w:spacing w:after="100"/>
+      </w:pPr>
+      <w:r>
+        <w:t xml:space="preserve">Find the gain margin of L(s) = K/(s(s + 2)(s + 10)) at K = 48, in decibels.</w:t>
+      </w:r>
+    </w:p>
+    <w:p>
+      <w:pPr>
+        <w:pStyle w:val="ListParagraph"/>
+        <w:numPr>
+          <w:ilvl w:val="0"/>
+          <w:numId w:val="30"/>
+        </w:numPr>
+        <w:spacing w:after="100"/>
+      </w:pPr>
+      <w:r>
+        <w:t xml:space="preserve">A loop has a phase margin of 45° at ω_c = 10 rad/s. Find its delay margin.</w:t>
+      </w:r>
+    </w:p>
+    <w:p>
+      <w:pPr>
+        <w:pStyle w:val="ListParagraph"/>
+        <w:numPr>
+          <w:ilvl w:val="0"/>
+          <w:numId w:val="30"/>
+        </w:numPr>
+        <w:spacing w:after="100"/>
+      </w:pPr>
+      <w:r>
+        <w:t xml:space="preserve">Find the gain and phase margins guaranteed by M_s = 1.4.</w:t>
+      </w:r>
+    </w:p>
+    <w:p>
+      <w:pPr>
+        <w:pStyle w:val="ListParagraph"/>
+        <w:numPr>
+          <w:ilvl w:val="0"/>
+          <w:numId w:val="30"/>
+        </w:numPr>
+        <w:spacing w:after="100"/>
+      </w:pPr>
+      <w:r>
+        <w:t xml:space="preserve">Find the delay margin for the K = 28.7 loop of Worked Example 30.1.</w:t>
+      </w:r>
+    </w:p>
+    <w:p>
+      <w:pPr>
+        <w:pStyle w:val="ListParagraph"/>
+        <w:numPr>
+          <w:ilvl w:val="0"/>
+          <w:numId w:val="30"/>
+        </w:numPr>
+        <w:spacing w:after="100"/>
+      </w:pPr>
+      <w:r>
+        <w:t xml:space="preserve">Why does the Bode sensitivity integral imply a waterbed effect?</w:t>
+      </w:r>
+    </w:p>
+    <w:p>
+      <w:pPr>
+        <w:pStyle w:val="Heading1"/>
+        <w:pageBreakBefore/>
+        <w:spacing w:before="480" w:after="240"/>
+      </w:pPr>
+      <w:r>
+        <w:t xml:space="preserve">Chapter 31 — Oscillators: Feedback That Is Meant to Ring</w:t>
+      </w:r>
+    </w:p>
+    <w:p>
+      <w:pPr>
+        <w:spacing w:after="200" w:line="276" w:lineRule="auto"/>
+      </w:pPr>
+      <w:r>
+        <w:t xml:space="preserve">Chapters 11 to 18 worked to keep loops away from the point where the loop gain is −1. An oscillator is a loop designed to sit exactly there. Every clock in Chapter 2's digital circuits, every carrier in a radio, and every timer that blinks a light comes from a circuit that turns its own noise into a steady waveform. This chapter states the condition for oscillation, builds the two families of oscillator, linear and relaxation, and sizes each with numbers.</w:t>
+      </w:r>
+    </w:p>
+    <w:p>
+      <w:pPr>
+        <w:pStyle w:val="Heading2"/>
+        <w:spacing w:before="360" w:after="160"/>
+      </w:pPr>
+      <w:r>
+        <w:t xml:space="preserve">31.1 The Barkhausen Condition</w:t>
+      </w:r>
+    </w:p>
+    <w:p>
+      <w:pPr>
+        <w:spacing w:after="200" w:line="276" w:lineRule="auto"/>
+      </w:pPr>
+      <w:r>
+        <w:t xml:space="preserve">Break a feedback loop and send a sine wave around it. If it returns with exactly the same amplitude and phase, the loop can sustain it without any input. That is the Barkhausen condition: the loop gain Aβ equals one, with a total phase shift of 0° or a multiple of 360°. A practical oscillator is designed with a loop gain slightly above one at the wanted frequency, so that noise grows into an oscillation, and some nonlinearity then limits the amplitude, reducing the effective gain to exactly one.</w:t>
+      </w:r>
+    </w:p>
+    <w:p>
+      <w:pPr>
+        <w:spacing w:before="200" w:after="200"/>
+        <w:jc w:val="center"/>
+      </w:pPr>
+      <w:r>
+        <w:t xml:space="preserve">A(jω₀) β(jω₀) = 1   (|Aβ| = 1,  ∠Aβ = 0° or 360°)</w:t>
+      </w:r>
+    </w:p>
+    <w:p>
+      <w:pPr>
+        <w:spacing w:after="200" w:line="276" w:lineRule="auto"/>
+      </w:pPr>
+      <w:r>
+        <w:t>The frequency is set by the network β, which has the right phase at only one frequency. The amplifier supplies the gain to make up the network's loss. The quality of the oscillator, its frequency stability and its phase noise as Book 4 measures it, depends on how sharply β's phase changes with frequency near ω₀: an RC network changes slowly, an LC tank faster, and a quartz crystal, with a Q of tens of thousands, fastest of all.</w:t>
+      </w:r>
+    </w:p>
+    <w:p>
+      <w:pPr>
+        <w:pStyle w:val="Heading2"/>
+        <w:spacing w:before="360" w:after="160"/>
+      </w:pPr>
+      <w:r>
+        <w:t xml:space="preserve">31.2 The Wien-Bridge Oscillator</w:t>
+      </w:r>
+    </w:p>
+    <w:p>
+      <w:pPr>
+        <w:spacing w:after="200" w:line="276" w:lineRule="auto"/>
+      </w:pPr>
+      <w:r>
+        <w:t xml:space="preserve">The Wien network is a series RC in the forward path and a parallel RC to ground. At ω₀ = 1/(RC) its phase shift is zero and its gain is exactly 1/3. A noninverting op-amp stage with a gain of 3, set by R_f = 2R_g, completes the loop. Because the required gain is exact, a fixed resistor ratio either fails to start or grows until the output clips; real Wien oscillators use a lamp, a thermistor, a JFET, or diodes to reduce the gain as the amplitude grows. Hewlett's 1939 audio oscillator, the first product of Hewlett-Packard, used a small incandescent lamp for exactly this purpose.</w:t>
+      </w:r>
+    </w:p>
+    <w:p>
+      <w:pPr>
+        <w:spacing w:before="200" w:after="200"/>
+        <w:jc w:val="center"/>
+      </w:pPr>
+      <w:r>
+        <w:t xml:space="preserve">f₀ = 1/(2πRC),   β(f₀) = 1/3,   A = 1 + R_f/R_g = 3</w:t>
+      </w:r>
+    </w:p>
+    <w:p>
+      <w:pPr>
+        <w:spacing w:before="200" w:after="80"/>
+      </w:pPr>
+      <w:r>
+        <w:rPr>
+          <w:b/>
+          <w:bCs/>
+        </w:rPr>
+        <w:t xml:space="preserve">Worked Example 31.1</w:t>
+      </w:r>
+    </w:p>
+    <w:p>
+      <w:pPr>
+        <w:shd w:val="clear" w:color="auto" w:fill="E8F0E8"/>
+        <w:spacing w:after="80"/>
+      </w:pPr>
+      <w:r>
+        <w:rPr>
+          <w:b/>
+          <w:bCs/>
+        </w:rPr>
+        <w:t xml:space="preserve">Problem: </w:t>
+      </w:r>
+      <w:r>
+        <w:t xml:space="preserve">A Wien-bridge oscillator uses R = 10 kΩ and C = 10 nF. Find its frequency and the feedback resistor needed with R_g = 4.7 kΩ.</w:t>
+      </w:r>
+    </w:p>
+    <w:p>
+      <w:pPr>
+        <w:shd w:val="clear" w:color="auto" w:fill="E8F0E8"/>
+        <w:spacing w:after="200"/>
+      </w:pPr>
+      <w:r>
+        <w:rPr>
+          <w:b/>
+          <w:bCs/>
+        </w:rPr>
+        <w:t xml:space="preserve">Solution: </w:t>
+      </w:r>
+      <w:r>
+        <w:t xml:space="preserve">f₀ = 1/(2π × 10⁴ × 10⁻⁸) = 1,592 Hz. R_f = 2R_g = 9.4 kΩ for a gain of exactly 3. In practice R_f is made slightly larger, perhaps 10 kΩ, so the oscillation starts reliably, and a pair of back-to-back diodes in series with a resistor across part of R_f lowers the gain as the amplitude grows, holding the output at a level set by the diode drops.</w:t>
+      </w:r>
+    </w:p>
+    <w:p>
+      <w:pPr>
+        <w:pStyle w:val="Heading2"/>
+        <w:spacing w:before="360" w:after="160"/>
+      </w:pPr>
+      <w:r>
+        <w:t xml:space="preserve">31.3 Phase-Shift and LC Oscillators</w:t>
+      </w:r>
+    </w:p>
+    <w:p>
+      <w:pPr>
+        <w:spacing w:after="200" w:line="276" w:lineRule="auto"/>
+      </w:pPr>
+      <w:r>
+        <w:t>Three cascaded RC sections with an inverting amplifier form the phase-shift oscillator. Each section adds lag until the total is 180° at f₀ = 1/(2π√6·RC), where the network attenuates by a factor of 29, so the amplifier needs a gain of at least 29. At radio frequencies, an LC tank provides the frequency. In the Colpitts oscillator, the tank's capacitance is split into two capacitors in series, whose midpoint supplies the feedback; the frequency is that of L with the series combination of C₁ and C₂. Book 4 treats these oscillators' phase noise; here the point is that the same Barkhausen condition governs them all.</w:t>
+      </w:r>
+    </w:p>
+    <w:p>
+      <w:pPr>
+        <w:spacing w:before="200" w:after="200"/>
+        <w:jc w:val="center"/>
+      </w:pPr>
+      <w:r>
+        <w:t xml:space="preserve">Phase shift: f₀ = 1/(2π√6·RC), |A| ≥ 29;   Colpitts: f₀ = 1/(2π√(L·C₁C₂/(C₁ + C₂)))</w:t>
+      </w:r>
+    </w:p>
+    <w:p>
+      <w:pPr>
+        <w:spacing w:before="200" w:after="80"/>
+      </w:pPr>
+      <w:r>
+        <w:rPr>
+          <w:b/>
+          <w:bCs/>
+        </w:rPr>
+        <w:t xml:space="preserve">Worked Example 31.2</w:t>
+      </w:r>
+    </w:p>
+    <w:p>
+      <w:pPr>
+        <w:shd w:val="clear" w:color="auto" w:fill="E8F0E8"/>
+        <w:spacing w:after="80"/>
+      </w:pPr>
+      <w:r>
+        <w:rPr>
+          <w:b/>
+          <w:bCs/>
+        </w:rPr>
+        <w:t xml:space="preserve">Problem: </w:t>
+      </w:r>
+      <w:r>
+        <w:t xml:space="preserve">Find the frequency of a phase-shift oscillator with R = 10 kΩ and C = 10 nF, and of a Colpitts oscillator with L = 1 µH and C₁ = C₂ = 200 pF.</w:t>
+      </w:r>
+    </w:p>
+    <w:p>
+      <w:pPr>
+        <w:shd w:val="clear" w:color="auto" w:fill="E8F0E8"/>
+        <w:spacing w:after="200"/>
+      </w:pPr>
+      <w:r>
+        <w:rPr>
+          <w:b/>
+          <w:bCs/>
+        </w:rPr>
+        <w:t xml:space="preserve">Solution: </w:t>
+      </w:r>
+      <w:r>
+        <w:t xml:space="preserve">The phase-shift oscillator runs at 1/(2π × 2.449 × 10⁴ × 10⁻⁸) = 650 Hz, with an amplifier gain of at least 29. For the Colpitts, the series capacitance is 100 pF, so f₀ = 1/(2π√(10⁻⁶ × 10⁻¹⁰)) = 15.9 MHz.</w:t>
+      </w:r>
+    </w:p>
+    <w:p>
+      <w:pPr>
+        <w:pStyle w:val="Heading2"/>
+        <w:spacing w:before="360" w:after="160"/>
+      </w:pPr>
+      <w:r>
+        <w:t xml:space="preserve">31.4 Relaxation Oscillators</w:t>
+      </w:r>
+    </w:p>
+    <w:p>
+      <w:pPr>
+        <w:spacing w:after="200" w:line="276" w:lineRule="auto"/>
+      </w:pPr>
+      <w:r>
+        <w:t xml:space="preserve">A relaxation oscillator does not use a resonant network. It charges a capacitor until a threshold is reached, switches, and discharges it to a second threshold. The Schmitt trigger of Chapter 16 provides the two thresholds. With an op-amp comparator whose positive feedback divider has ratio β = R₂/(R₁ + R₂), and an RC from output to the inverting input, the capacitor swings between +βV and −βV, and each half cycle takes RC ln((1 + β)/(1 − β)).</w:t>
+      </w:r>
+    </w:p>
+    <w:p>
+      <w:pPr>
+        <w:spacing w:before="200" w:after="200"/>
+        <w:jc w:val="center"/>
+      </w:pPr>
+      <w:r>
+        <w:t xml:space="preserve">T = 2RC ln((1 + β)/(1 − β));   β = 0.5 gives T = 2.197 RC</w:t>
+      </w:r>
+    </w:p>
+    <w:p>
+      <w:pPr>
+        <w:spacing w:before="200" w:after="80"/>
+      </w:pPr>
+      <w:r>
+        <w:rPr>
+          <w:b/>
+          <w:bCs/>
+        </w:rPr>
+        <w:t xml:space="preserve">Worked Example 31.3</w:t>
+      </w:r>
+    </w:p>
+    <w:p>
+      <w:pPr>
+        <w:shd w:val="clear" w:color="auto" w:fill="E8F0E8"/>
+        <w:spacing w:after="80"/>
+      </w:pPr>
+      <w:r>
+        <w:rPr>
+          <w:b/>
+          <w:bCs/>
+        </w:rPr>
+        <w:t xml:space="preserve">Problem: </w:t>
+      </w:r>
+      <w:r>
+        <w:t xml:space="preserve">An op-amp relaxation oscillator uses R = 10 kΩ, C = 100 nF, and a hysteresis divider with β = 0.5. Find the period and frequency.</w:t>
+      </w:r>
+    </w:p>
+    <w:p>
+      <w:pPr>
+        <w:shd w:val="clear" w:color="auto" w:fill="E8F0E8"/>
+        <w:spacing w:after="200"/>
+      </w:pPr>
+      <w:r>
+        <w:rPr>
+          <w:b/>
+          <w:bCs/>
+        </w:rPr>
+        <w:t xml:space="preserve">Solution: </w:t>
+      </w:r>
+      <w:r>
+        <w:t xml:space="preserve">T = 2 × 10⁴ × 10⁻⁷ × ln(1.5/0.5) = 2 × 10⁻³ × 1.0986 = 2.197 ms, so f = 455 Hz. The frequency depends on the ratio of thresholds, not on the supply voltage, as long as the output swings symmetrically.</w:t>
+      </w:r>
+    </w:p>
+    <w:p>
+      <w:pPr>
+        <w:spacing w:before="200" w:after="60"/>
+        <w:jc w:val="center"/>
+      </w:pPr>
+      <w:r>
+        <w:drawing>
+          <wp:inline xmlns:a="http://schemas.openxmlformats.org/drawingml/2006/main" xmlns:pic="http://schemas.openxmlformats.org/drawingml/2006/picture">
+            <wp:extent cx="4379976" cy="2116988"/>
+            <wp:docPr id="2126307778" name="Picture 2126307778"/>
+            <wp:cNvGraphicFramePr>
+              <a:graphicFrameLocks noChangeAspect="1"/>
+            </wp:cNvGraphicFramePr>
+            <a:graphic>
+              <a:graphicData uri="http://schemas.openxmlformats.org/drawingml/2006/picture">
+                <pic:pic>
+                  <pic:nvPicPr>
+                    <pic:cNvPr id="0" name="fig31_1.png"/>
+                    <pic:cNvPicPr/>
+                  </pic:nvPicPr>
+                  <pic:blipFill>
+                    <a:blip r:embed="rId39"/>
+                    <a:stretch>
+                      <a:fillRect/>
+                    </a:stretch>
+                  </pic:blipFill>
+                  <pic:spPr>
+                    <a:xfrm>
+                      <a:off x="0" y="0"/>
+                      <a:ext cx="4379976" cy="2116988"/>
+                    </a:xfrm>
+                    <a:prstGeom prst="rect"/>
+                  </pic:spPr>
+                </pic:pic>
+              </a:graphicData>
+            </a:graphic>
+          </wp:inline>
+        </w:drawing>
+      </w:r>
+    </w:p>
+    <w:p>
+      <w:pPr>
+        <w:spacing w:after="200"/>
+        <w:jc w:val="center"/>
+      </w:pPr>
+      <w:r>
+        <w:rPr>
+          <w:i/>
+          <w:iCs/>
+          <w:color w:val="555555"/>
+          <w:sz w:val="19"/>
+          <w:szCs w:val="19"/>
+        </w:rPr>
+        <w:t xml:space="preserve">Figure 31.1 — Relaxation oscillator waveforms for R = 10 kΩ, C = 100 nF, β = 0.5: the capacitor voltage ramps exponentially between ±βV while the comparator output switches between ±V, with a period of 2.197 ms.</w:t>
+      </w:r>
+    </w:p>
+    <w:p>
+      <w:pPr>
+        <w:spacing w:after="200" w:line="276" w:lineRule="auto"/>
+      </w:pPr>
+      <w:r>
+        <w:t xml:space="preserve">The 555 timer, introduced in 1972 and still made in billions, is a packaged relaxation oscillator. Two comparators at one-third and two-thirds of the supply, a flip-flop, and a discharge transistor charge C through R₁ + R₂ and discharge it through R₂. Its frequency is 1.44/((R₁ + 2R₂)C), and its duty cycle (R₁ + R₂)/(R₁ + 2R₂) is always above 50% in the basic circuit. With R₁ = 1 kΩ, R₂ = 10 kΩ, and C = 10 nF it runs at 6,857 Hz with a duty cycle of 52.4%.</w:t>
+      </w:r>
+    </w:p>
+    <w:p>
+      <w:pPr>
+        <w:shd w:val="clear" w:color="auto" w:fill="EFEFEF"/>
+        <w:spacing w:before="120" w:after="80"/>
+      </w:pPr>
+      <w:r>
+        <w:rPr>
+          <w:b/>
+          <w:bCs/>
+        </w:rPr>
+        <w:t xml:space="preserve">Key Idea</w:t>
+      </w:r>
+    </w:p>
+    <w:p>
+      <w:pPr>
+        <w:shd w:val="clear" w:color="auto" w:fill="EFEFEF"/>
+        <w:spacing w:after="120"/>
+      </w:pPr>
+      <w:r>
+        <w:rPr>
+          <w:b/>
+          <w:bCs/>
+        </w:rPr>
+        <w:t xml:space="preserve">An oscillator is a loop with a gain of exactly one and a phase of exactly zero at one frequency. </w:t>
+      </w:r>
+      <w:r>
+        <w:t xml:space="preserve">The network sets the frequency, the amplifier makes up the loss, and a nonlinearity holds the amplitude; the sharper the network's phase versus frequency, the more stable the oscillator.</w:t>
+      </w:r>
+    </w:p>
+    <w:p>
+      <w:pPr>
+        <w:pStyle w:val="Heading2"/>
+        <w:spacing w:before="360" w:after="160"/>
+      </w:pPr>
+      <w:r>
+        <w:t xml:space="preserve">31.5 The Crystal Oscillator</w:t>
+      </w:r>
+    </w:p>
+    <w:p>
+      <w:pPr>
+        <w:spacing w:after="200" w:line="276" w:lineRule="auto"/>
+      </w:pPr>
+      <w:r>
+        <w:t xml:space="preserve">Every microcontroller clock in Chapter 2 starts from a quartz crystal in a Pierce oscillator: an inverting gate biased into its linear region, the crystal across it, and two capacitors to ground. The crystal is cut to resonate at its marked frequency when it sees a specified load capacitance C_L, typically 8 to 20 pF. The two capacitors appear in series, plus the stray capacitance of the pins and traces. With 22 pF on each side and 5 pF of stray, C_L = 22 × 22/44 + 5 = 16 pF. Choosing them wrong pulls the frequency by tens of parts per million, enough to break a UART at the edge of its tolerance or a radio's channel accuracy in Book 5.</w:t>
+      </w:r>
+    </w:p>
+    <w:p>
+      <w:pPr>
+        <w:shd w:val="clear" w:color="auto" w:fill="FCEEEA"/>
+        <w:spacing w:before="120" w:after="80"/>
+      </w:pPr>
+      <w:r>
+        <w:rPr>
+          <w:b/>
+          <w:bCs/>
+        </w:rPr>
+        <w:t xml:space="preserve">Common Misconception</w:t>
+      </w:r>
+    </w:p>
+    <w:p>
+      <w:pPr>
+        <w:shd w:val="clear" w:color="auto" w:fill="FCEEEA"/>
+        <w:spacing w:after="120"/>
+      </w:pPr>
+      <w:r>
+        <w:t xml:space="preserve">An oscillator that works on the bench is not proven. The startup gain margin shrinks at low temperature and low supply voltage, the crystal's drive level can be exceeded, and a scope probe's capacitance can pull or even start an oscillator that would otherwise fail. Verify startup at the corners of temperature and supply, and measure frequency with a buffered output or a low-capacitance probe.</w:t>
+      </w:r>
+    </w:p>
+    <w:p>
+      <w:pPr>
+        <w:pStyle w:val="ListParagraph"/>
+        <w:numPr>
+          <w:ilvl w:val="0"/>
+          <w:numId w:val="31"/>
+        </w:numPr>
+        <w:spacing w:after="100"/>
+      </w:pPr>
+      <w:r>
+        <w:t xml:space="preserve">Find the frequency of a Wien-bridge oscillator with R = 4.7 kΩ and C = 22 nF.</w:t>
+      </w:r>
+    </w:p>
+    <w:p>
+      <w:pPr>
+        <w:pStyle w:val="ListParagraph"/>
+        <w:numPr>
+          <w:ilvl w:val="0"/>
+          <w:numId w:val="31"/>
+        </w:numPr>
+        <w:spacing w:after="100"/>
+      </w:pPr>
+      <w:r>
+        <w:t xml:space="preserve">Find the frequency of a relaxation oscillator with R = 10 kΩ, C = 10 nF, and β = 1/3.</w:t>
+      </w:r>
+    </w:p>
+    <w:p>
+      <w:pPr>
+        <w:pStyle w:val="ListParagraph"/>
+        <w:numPr>
+          <w:ilvl w:val="0"/>
+          <w:numId w:val="31"/>
+        </w:numPr>
+        <w:spacing w:after="100"/>
+      </w:pPr>
+      <w:r>
+        <w:t xml:space="preserve">Find the frequency and duty cycle of a 555 with R₁ = R₂ = 10 kΩ and C = 100 nF.</w:t>
+      </w:r>
+    </w:p>
+    <w:p>
+      <w:pPr>
+        <w:pStyle w:val="ListParagraph"/>
+        <w:numPr>
+          <w:ilvl w:val="0"/>
+          <w:numId w:val="31"/>
+        </w:numPr>
+        <w:spacing w:after="100"/>
+      </w:pPr>
+      <w:r>
+        <w:t xml:space="preserve">Find the frequency of a Colpitts oscillator with L = 10 µH and C₁ = C₂ = 1 nF.</w:t>
+      </w:r>
+    </w:p>
+    <w:p>
+      <w:pPr>
+        <w:pStyle w:val="ListParagraph"/>
+        <w:numPr>
+          <w:ilvl w:val="0"/>
+          <w:numId w:val="31"/>
+        </w:numPr>
+        <w:spacing w:after="100"/>
+      </w:pPr>
+      <w:r>
+        <w:t xml:space="preserve">Find the load capacitance of a Pierce oscillator with 33 pF capacitors and 4 pF of stray.</w:t>
+      </w:r>
+    </w:p>
+    <w:p>
+      <w:pPr>
+        <w:pStyle w:val="ListParagraph"/>
+        <w:numPr>
+          <w:ilvl w:val="0"/>
+          <w:numId w:val="31"/>
+        </w:numPr>
+        <w:spacing w:after="100"/>
+      </w:pPr>
+      <w:r>
+        <w:t xml:space="preserve">Why does a Wien-bridge oscillator need amplitude control?</w:t>
+      </w:r>
+    </w:p>
+    <w:p>
+      <w:pPr>
+        <w:pStyle w:val="Heading1"/>
+        <w:pageBreakBefore/>
+        <w:spacing w:before="480" w:after="240"/>
+      </w:pPr>
+      <w:r>
+        <w:t xml:space="preserve">Chapter 32 — Timing: Setup, Hold, and Metastability</w:t>
+      </w:r>
+    </w:p>
+    <w:p>
+      <w:pPr>
+        <w:spacing w:after="200" w:line="276" w:lineRule="auto"/>
+      </w:pPr>
+      <w:r>
+        <w:t xml:space="preserve">Chapter 4 built sequential circuits from flip-flops as if each one sampled its input at an instant. A real flip-flop needs its input to be steady for a short time before and after the clock edge, its output changes a little after the edge, and the logic between flip-flops takes time to settle. Those few numbers set the fastest clock a design can use and decide whether it works at all. When an input is not synchronized to the clock, as with a button, a sensor, or a signal from another clock domain, a flip-flop can be caught halfway and take an unpredictable time to decide. This chapter puts numbers on both problems.</w:t>
+      </w:r>
+    </w:p>
+    <w:p>
+      <w:pPr>
+        <w:pStyle w:val="Heading2"/>
+        <w:spacing w:before="360" w:after="160"/>
+      </w:pPr>
+      <w:r>
+        <w:t xml:space="preserve">32.1 Setup and Hold</w:t>
+      </w:r>
+    </w:p>
+    <w:p>
+      <w:pPr>
+        <w:spacing w:after="200" w:line="276" w:lineRule="auto"/>
+      </w:pPr>
+      <w:r>
+        <w:t xml:space="preserve">A flip-flop's datasheet gives three times. The setup time t_su is how long before the clock edge the input must be stable; the hold time t_h is how long after the edge it must remain stable; the clock-to-output delay t_cq is how long after the edge the output changes. Between two flip-flops sits combinational logic with a longest (propagation) delay t_pd and a shortest (contamination) delay t_cd. Clock skew t_skew, the difference in clock arrival time between the two flip-flops, can help one check and hurt the other.</w:t>
+      </w:r>
+    </w:p>
+    <w:p>
+      <w:pPr>
+        <w:spacing w:after="200" w:line="276" w:lineRule="auto"/>
+      </w:pPr>
+      <w:r>
+        <w:t xml:space="preserve">The setup check asks whether data launched at one edge arrives before the next edge, less the setup time. The hold check asks whether data launched at an edge arrives too soon, corrupting the value the receiving flip-flop is still capturing from the same edge. A setup failure can be fixed by slowing the clock; a hold failure cannot, because it does not depend on the clock period, which is why hold violations are the more dangerous of the two.</w:t>
+      </w:r>
+    </w:p>
+    <w:p>
+      <w:pPr>
+        <w:spacing w:before="200" w:after="200"/>
+        <w:jc w:val="center"/>
+      </w:pPr>
+      <w:r>
+        <w:t xml:space="preserve">Setup: T_clk ≥ t_cq + t_pd + t_su + t_skew,    Hold: t_cq + t_cd ≥ t_h + t_skew</w:t>
+      </w:r>
+    </w:p>
+    <w:p>
+      <w:pPr>
+        <w:spacing w:before="200" w:after="80"/>
+      </w:pPr>
+      <w:r>
+        <w:rPr>
+          <w:b/>
+          <w:bCs/>
+        </w:rPr>
+        <w:t xml:space="preserve">Worked Example 32.1</w:t>
+      </w:r>
+    </w:p>
+    <w:p>
+      <w:pPr>
+        <w:shd w:val="clear" w:color="auto" w:fill="E8F0E8"/>
+        <w:spacing w:after="80"/>
+      </w:pPr>
+      <w:r>
+        <w:rPr>
+          <w:b/>
+          <w:bCs/>
+        </w:rPr>
+        <w:t xml:space="preserve">Problem: </w:t>
+      </w:r>
+      <w:r>
+        <w:t xml:space="preserve">A path has t_cq = 0.5 ns, t_pd = 6.0 ns, t_su = 0.3 ns, and 0.2 ns of adverse skew. Find the minimum clock period and the maximum frequency. If the same flip-flops have t_h = 0.2 ns and the shortest path has t_cq = 0.3 ns and t_cd = 0.1 ns with 0.3 ns of skew in the other direction, does the hold check pass?</w:t>
+      </w:r>
+    </w:p>
+    <w:p>
+      <w:pPr>
+        <w:shd w:val="clear" w:color="auto" w:fill="E8F0E8"/>
+        <w:spacing w:after="200"/>
+      </w:pPr>
+      <w:r>
+        <w:rPr>
+          <w:b/>
+          <w:bCs/>
+        </w:rPr>
+        <w:t xml:space="preserve">Solution: </w:t>
+      </w:r>
+      <w:r>
+        <w:t xml:space="preserve">T_clk ≥ 0.5 + 6.0 + 0.3 + 0.2 = 7.0 ns, so f_max = 142.9 MHz. For hold, t_cq + t_cd = 0.4 ns must be at least t_h + t_skew = 0.5 ns; it is not, so the path fails hold by 0.1 ns at every clock frequency. The cure is to add delay, a buffer or two, to the short path, or to reduce the skew.</w:t>
+      </w:r>
+    </w:p>
+    <w:p>
+      <w:pPr>
+        <w:pStyle w:val="Heading2"/>
+        <w:spacing w:before="360" w:after="160"/>
+      </w:pPr>
+      <w:r>
+        <w:t xml:space="preserve">32.2 Slack and the Critical Path</w:t>
+      </w:r>
+    </w:p>
+    <w:p>
+      <w:pPr>
+        <w:spacing w:after="200" w:line="276" w:lineRule="auto"/>
+      </w:pPr>
+      <w:r>
+        <w:t xml:space="preserve">Timing tools report slack: the margin by which each path meets its requirement. Positive slack means the path passes; negative slack means it fails. The path with the least slack is the critical path, and it alone limits the clock. Shortening it, by moving logic, adding a pipeline register, or choosing faster gates, raises the clock until another path becomes critical. Pipelining splits a long path into stages with registers between them, which raises the clock rate at the cost of latency, the same trade that Chapter 19's digital controller makes when it accepts one period of compute delay.</w:t>
+      </w:r>
+    </w:p>
+    <w:p>
+      <w:pPr>
+        <w:shd w:val="clear" w:color="auto" w:fill="EFEFEF"/>
+        <w:spacing w:before="120" w:after="80"/>
+      </w:pPr>
+      <w:r>
+        <w:rPr>
+          <w:b/>
+          <w:bCs/>
+        </w:rPr>
+        <w:t xml:space="preserve">Key Idea</w:t>
+      </w:r>
+    </w:p>
+    <w:p>
+      <w:pPr>
+        <w:shd w:val="clear" w:color="auto" w:fill="EFEFEF"/>
+        <w:spacing w:after="120"/>
+      </w:pPr>
+      <w:r>
+        <w:rPr>
+          <w:b/>
+          <w:bCs/>
+        </w:rPr>
+        <w:t xml:space="preserve">The clock period is set by the slowest path; correctness is set by the fastest one. </w:t>
+      </w:r>
+      <w:r>
+        <w:t xml:space="preserve">Setup failures yield to a slower clock, hold failures do not, so hold must be checked with minimum delays and worst-case skew at every corner.</w:t>
+      </w:r>
+    </w:p>
+    <w:p>
+      <w:pPr>
+        <w:pStyle w:val="Heading2"/>
+        <w:spacing w:before="360" w:after="160"/>
+      </w:pPr>
+      <w:r>
+        <w:t xml:space="preserve">32.3 Metastability</w:t>
+      </w:r>
+    </w:p>
+    <w:p>
+      <w:pPr>
+        <w:spacing w:after="200" w:line="276" w:lineRule="auto"/>
+      </w:pPr>
+      <w:r>
+        <w:t xml:space="preserve">If the input of a flip-flop changes inside its setup-hold window, the internal latch can be left balanced between 0 and 1, like a ball on a hill. It will fall to one side, but the time it takes is random, with a probability of still being undecided that decays exponentially with a time constant τ, a property of the latch's transistors that is typically tens of picoseconds in modern logic. If the next stage samples the output before it has resolved, the undecided value can propagate as different values to different parts of the logic, which is a failure that no simulation of ideal flip-flops will show.</w:t>
+      </w:r>
+    </w:p>
+    <w:p>
+      <w:pPr>
+        <w:spacing w:after="200" w:line="276" w:lineRule="auto"/>
+      </w:pPr>
+      <w:r>
+        <w:t xml:space="preserve">The mean time between failures for a synchronizer depends on the time t_r allowed for resolution, the latch's τ, the width of its vulnerable window T_w, the clock frequency, and the rate at which the asynchronous input changes. The exponential makes the result extraordinarily sensitive to t_r.</w:t>
+      </w:r>
+    </w:p>
+    <w:p>
+      <w:pPr>
+        <w:spacing w:before="200" w:after="200"/>
+        <w:jc w:val="center"/>
+      </w:pPr>
+      <w:r>
+        <w:t xml:space="preserve">MTBF = e^(t_r/τ) / (T_w · f_clk · f_data)</w:t>
+      </w:r>
+    </w:p>
+    <w:p>
+      <w:pPr>
+        <w:spacing w:before="200" w:after="80"/>
+      </w:pPr>
+      <w:r>
+        <w:rPr>
+          <w:b/>
+          <w:bCs/>
+        </w:rPr>
+        <w:t xml:space="preserve">Worked Example 32.2</w:t>
+      </w:r>
+    </w:p>
+    <w:p>
+      <w:pPr>
+        <w:shd w:val="clear" w:color="auto" w:fill="E8F0E8"/>
+        <w:spacing w:after="80"/>
+      </w:pPr>
+      <w:r>
+        <w:rPr>
+          <w:b/>
+          <w:bCs/>
+        </w:rPr>
+        <w:t xml:space="preserve">Problem: </w:t>
+      </w:r>
+      <w:r>
+        <w:t xml:space="preserve">A flip-flop with τ = 50 ps and T_w = 100 ps samples an asynchronous signal that changes 10 million times per second, on a 200 MHz clock. Find the MTBF if the logic after it leaves 1.0 ns for resolution, and if a second flip-flop is added so that nearly a full period, 4.5 ns, is available.</w:t>
+      </w:r>
+    </w:p>
+    <w:p>
+      <w:pPr>
+        <w:shd w:val="clear" w:color="auto" w:fill="E8F0E8"/>
+        <w:spacing w:after="200"/>
+      </w:pPr>
+      <w:r>
+        <w:rPr>
+          <w:b/>
+          <w:bCs/>
+        </w:rPr>
+        <w:t xml:space="preserve">Solution: </w:t>
+      </w:r>
+      <w:r>
+        <w:t xml:space="preserve">The denominator is 10⁻¹⁰ × 2 × 10⁸ × 10⁷ = 2 × 10⁵ per second. With t_r = 1.0 ns, e^(20) = 4.85 × 10⁸, so MTBF = 2,426 s, about 40 minutes: the product fails many times a day. With t_r = 4.5 ns, e^(90) = 1.22 × 10³⁹, so MTBF = 6.1 × 10³³ s, about 1.9 × 10²⁶ years. The second flip-flop costs one clock period of latency and buys a factor of 10³⁰.</w:t>
+      </w:r>
+    </w:p>
+    <w:p>
+      <w:pPr>
+        <w:spacing w:before="200" w:after="60"/>
+        <w:jc w:val="center"/>
+      </w:pPr>
+      <w:r>
+        <w:drawing>
+          <wp:inline xmlns:a="http://schemas.openxmlformats.org/drawingml/2006/main" xmlns:pic="http://schemas.openxmlformats.org/drawingml/2006/picture">
+            <wp:extent cx="4379976" cy="2116988"/>
+            <wp:docPr id="2126307779" name="Picture 2126307779"/>
+            <wp:cNvGraphicFramePr>
+              <a:graphicFrameLocks noChangeAspect="1"/>
+            </wp:cNvGraphicFramePr>
+            <a:graphic>
+              <a:graphicData uri="http://schemas.openxmlformats.org/drawingml/2006/picture">
+                <pic:pic>
+                  <pic:nvPicPr>
+                    <pic:cNvPr id="0" name="fig32_1.png"/>
+                    <pic:cNvPicPr/>
+                  </pic:nvPicPr>
+                  <pic:blipFill>
+                    <a:blip r:embed="rId40"/>
+                    <a:stretch>
+                      <a:fillRect/>
+                    </a:stretch>
+                  </pic:blipFill>
+                  <pic:spPr>
+                    <a:xfrm>
+                      <a:off x="0" y="0"/>
+                      <a:ext cx="4379976" cy="2116988"/>
+                    </a:xfrm>
+                    <a:prstGeom prst="rect"/>
+                  </pic:spPr>
+                </pic:pic>
+              </a:graphicData>
+            </a:graphic>
+          </wp:inline>
+        </w:drawing>
+      </w:r>
+    </w:p>
+    <w:p>
+      <w:pPr>
+        <w:spacing w:after="200"/>
+        <w:jc w:val="center"/>
+      </w:pPr>
+      <w:r>
+        <w:rPr>
+          <w:i/>
+          <w:iCs/>
+          <w:color w:val="555555"/>
+          <w:sz w:val="19"/>
+          <w:szCs w:val="19"/>
+        </w:rPr>
+        <w:t xml:space="preserve">Figure 32.1 — Synchronizer MTBF versus resolution time for τ = 50 ps, T_w = 100 ps, f_clk = 200 MHz, and f_data = 10 MHz. Each 115 ps of added resolution time multiplies the MTBF by ten; the single-flop (1.0 ns) and two-flop (4.5 ns) cases of Worked Example 32.2 are marked.</w:t>
+      </w:r>
+    </w:p>
+    <w:p>
+      <w:pPr>
+        <w:pStyle w:val="Heading2"/>
+        <w:spacing w:before="360" w:after="160"/>
+      </w:pPr>
+      <w:r>
+        <w:t xml:space="preserve">32.4 Crossing Clock Domains</w:t>
+      </w:r>
+    </w:p>
+    <w:p>
+      <w:pPr>
+        <w:spacing w:after="200" w:line="276" w:lineRule="auto"/>
+      </w:pPr>
+      <w:r>
+        <w:t xml:space="preserve">The two-flip-flop synchronizer is safe for one bit. For a multi-bit value, such as a counter or a FIFO pointer, synchronizing each bit separately is not safe: if several bits change at once, some may be captured before the change and some after, giving a value that never existed. The standard fixes are Gray-code counters, in which only one bit changes per step, so that a captured value is either the old one or the new one; handshakes, in which a single synchronized flag announces that a multi-bit bus is stable; and dual-clock FIFOs, which combine Gray-coded pointers with memory. Every input from a button, a sensor, or another chip with its own oscillator is a clock-domain crossing and needs one of them.</w:t>
+      </w:r>
+    </w:p>
+    <w:p>
+      <w:pPr>
+        <w:shd w:val="clear" w:color="auto" w:fill="FCEEEA"/>
+        <w:spacing w:before="120" w:after="80"/>
+      </w:pPr>
+      <w:r>
+        <w:rPr>
+          <w:b/>
+          <w:bCs/>
+        </w:rPr>
+        <w:t xml:space="preserve">Common Misconception</w:t>
+      </w:r>
+    </w:p>
+    <w:p>
+      <w:pPr>
+        <w:shd w:val="clear" w:color="auto" w:fill="FCEEEA"/>
+        <w:spacing w:after="120"/>
+      </w:pPr>
+      <w:r>
+        <w:t xml:space="preserve">A synchronizer does not remove metastability; it makes it rare. MTBF is a statistical figure, and a design with an MTBF of 40 minutes will fail in testing only occasionally, often blamed on noise. The fix is to compute the MTBF from the data sheet's τ and T_w at the worst-case temperature and supply, and to choose enough synchronizer stages that it exceeds the product's life by many orders of magnitude.</w:t>
+      </w:r>
+    </w:p>
+    <w:p>
+      <w:pPr>
+        <w:pStyle w:val="ListParagraph"/>
+        <w:numPr>
+          <w:ilvl w:val="0"/>
+          <w:numId w:val="32"/>
+        </w:numPr>
+        <w:spacing w:after="100"/>
+      </w:pPr>
+      <w:r>
+        <w:t xml:space="preserve">Find the maximum clock frequency for t_cq = 0.4 ns, t_pd = 4.0 ns, t_su = 0.2 ns, and 0.1 ns of skew.</w:t>
+      </w:r>
+    </w:p>
+    <w:p>
+      <w:pPr>
+        <w:pStyle w:val="ListParagraph"/>
+        <w:numPr>
+          <w:ilvl w:val="0"/>
+          <w:numId w:val="32"/>
+        </w:numPr>
+        <w:spacing w:after="100"/>
+      </w:pPr>
+      <w:r>
+        <w:t xml:space="preserve">A short path has t_cq = 0.35 ns and t_cd = 0.05 ns; the flip-flop has t_h = 0.25 ns, and the skew is 0.2 ns. Does it pass hold?</w:t>
+      </w:r>
+    </w:p>
+    <w:p>
+      <w:pPr>
+        <w:pStyle w:val="ListParagraph"/>
+        <w:numPr>
+          <w:ilvl w:val="0"/>
+          <w:numId w:val="32"/>
+        </w:numPr>
+        <w:spacing w:after="100"/>
+      </w:pPr>
+      <w:r>
+        <w:t xml:space="preserve">For the synchronizer of Worked Example 32.2, find the MTBF with t_r = 1.5 ns.</w:t>
+      </w:r>
+    </w:p>
+    <w:p>
+      <w:pPr>
+        <w:pStyle w:val="ListParagraph"/>
+        <w:numPr>
+          <w:ilvl w:val="0"/>
+          <w:numId w:val="32"/>
+        </w:numPr>
+        <w:spacing w:after="100"/>
+      </w:pPr>
+      <w:r>
+        <w:t xml:space="preserve">By what factor does the MTBF grow for each additional τ of resolution time?</w:t>
+      </w:r>
+    </w:p>
+    <w:p>
+      <w:pPr>
+        <w:pStyle w:val="ListParagraph"/>
+        <w:numPr>
+          <w:ilvl w:val="0"/>
+          <w:numId w:val="32"/>
+        </w:numPr>
+        <w:spacing w:after="100"/>
+      </w:pPr>
+      <w:r>
+        <w:t xml:space="preserve">Why are FIFO pointers passed between clock domains in Gray code?</w:t>
+      </w:r>
+    </w:p>
+    <w:p>
+      <w:pPr>
+        <w:pStyle w:val="ListParagraph"/>
+        <w:numPr>
+          <w:ilvl w:val="0"/>
+          <w:numId w:val="32"/>
+        </w:numPr>
+        <w:spacing w:after="100"/>
+      </w:pPr>
+      <w:r>
+        <w:t xml:space="preserve">A path needs 7.0 ns and the clock period is 10 ns. What is its slack?</w:t>
       </w:r>
     </w:p>
     <w:p>
@@ -15736,6 +17408,314 @@
           </w:p>
         </w:tc>
       </w:tr>
+      <w:tr>
+        <w:tblPrEx>
+          <w:tblCellMar>
+            <w:top w:w="0" w:type="dxa"/>
+            <w:bottom w:w="0" w:type="dxa"/>
+          </w:tblCellMar>
+        </w:tblPrEx>
+        <w:tc>
+          <w:tcPr>
+            <w:tcW w:w="0" w:type="auto"/>
+          </w:tcPr>
+          <w:p>
+            <w:r>
+              <w:t>Root-locus asymptotes</w:t>
+            </w:r>
+          </w:p>
+        </w:tc>
+        <w:tc>
+          <w:tcPr>
+            <w:tcW w:w="0" w:type="auto"/>
+          </w:tcPr>
+          <w:p>
+            <w:r>
+              <w:t>angles (2k + 1)180°/(n − m);  centroid (Σp − Σz)/(n − m)</w:t>
+            </w:r>
+          </w:p>
+        </w:tc>
+      </w:tr>
+      <w:tr>
+        <w:tblPrEx>
+          <w:tblCellMar>
+            <w:top w:w="0" w:type="dxa"/>
+            <w:bottom w:w="0" w:type="dxa"/>
+          </w:tblCellMar>
+        </w:tblPrEx>
+        <w:tc>
+          <w:tcPr>
+            <w:tcW w:w="0" w:type="auto"/>
+          </w:tcPr>
+          <w:p>
+            <w:r>
+              <w:t>Locus gain</w:t>
+            </w:r>
+          </w:p>
+        </w:tc>
+        <w:tc>
+          <w:tcPr>
+            <w:tcW w:w="0" w:type="auto"/>
+          </w:tcPr>
+          <w:p>
+            <w:r>
+              <w:t>K = 1/|G(s)| at a point satisfying ∠G(s) = 180°</w:t>
+            </w:r>
+          </w:p>
+        </w:tc>
+      </w:tr>
+      <w:tr>
+        <w:tblPrEx>
+          <w:tblCellMar>
+            <w:top w:w="0" w:type="dxa"/>
+            <w:bottom w:w="0" w:type="dxa"/>
+          </w:tblCellMar>
+        </w:tblPrEx>
+        <w:tc>
+          <w:tcPr>
+            <w:tcW w:w="0" w:type="auto"/>
+          </w:tcPr>
+          <w:p>
+            <w:r>
+              <w:t>Second-order specs</w:t>
+            </w:r>
+          </w:p>
+        </w:tc>
+        <w:tc>
+          <w:tcPr>
+            <w:tcW w:w="0" w:type="auto"/>
+          </w:tcPr>
+          <w:p>
+            <w:r>
+              <w:t>overshoot exp(−πζ/√(1 − ζ²));  t_s(2%) ≈ 4/(ζω_n)</w:t>
+            </w:r>
+          </w:p>
+        </w:tc>
+      </w:tr>
+      <w:tr>
+        <w:tblPrEx>
+          <w:tblCellMar>
+            <w:top w:w="0" w:type="dxa"/>
+            <w:bottom w:w="0" w:type="dxa"/>
+          </w:tblCellMar>
+        </w:tblPrEx>
+        <w:tc>
+          <w:tcPr>
+            <w:tcW w:w="0" w:type="auto"/>
+          </w:tcPr>
+          <w:p>
+            <w:r>
+              <w:t>Nyquist criterion</w:t>
+            </w:r>
+          </w:p>
+        </w:tc>
+        <w:tc>
+          <w:tcPr>
+            <w:tcW w:w="0" w:type="auto"/>
+          </w:tcPr>
+          <w:p>
+            <w:r>
+              <w:t>Z = N + P</w:t>
+            </w:r>
+          </w:p>
+        </w:tc>
+      </w:tr>
+      <w:tr>
+        <w:tblPrEx>
+          <w:tblCellMar>
+            <w:top w:w="0" w:type="dxa"/>
+            <w:bottom w:w="0" w:type="dxa"/>
+          </w:tblCellMar>
+        </w:tblPrEx>
+        <w:tc>
+          <w:tcPr>
+            <w:tcW w:w="0" w:type="auto"/>
+          </w:tcPr>
+          <w:p>
+            <w:r>
+              <w:t>Margins</w:t>
+            </w:r>
+          </w:p>
+        </w:tc>
+        <w:tc>
+          <w:tcPr>
+            <w:tcW w:w="0" w:type="auto"/>
+          </w:tcPr>
+          <w:p>
+            <w:r>
+              <w:t>GM = 1/|L(jω₁₈₀)|;  PM = 180° + ∠L(jω_c);  τ_max = PM/ω_c</w:t>
+            </w:r>
+          </w:p>
+        </w:tc>
+      </w:tr>
+      <w:tr>
+        <w:tblPrEx>
+          <w:tblCellMar>
+            <w:top w:w="0" w:type="dxa"/>
+            <w:bottom w:w="0" w:type="dxa"/>
+          </w:tblCellMar>
+        </w:tblPrEx>
+        <w:tc>
+          <w:tcPr>
+            <w:tcW w:w="0" w:type="auto"/>
+          </w:tcPr>
+          <w:p>
+            <w:r>
+              <w:t>Sensitivity bounds</w:t>
+            </w:r>
+          </w:p>
+        </w:tc>
+        <w:tc>
+          <w:tcPr>
+            <w:tcW w:w="0" w:type="auto"/>
+          </w:tcPr>
+          <w:p>
+            <w:r>
+              <w:t>GM ≥ M_s/(M_s − 1);  PM ≥ 2 arcsin(1/(2M_s))</w:t>
+            </w:r>
+          </w:p>
+        </w:tc>
+      </w:tr>
+      <w:tr>
+        <w:tblPrEx>
+          <w:tblCellMar>
+            <w:top w:w="0" w:type="dxa"/>
+            <w:bottom w:w="0" w:type="dxa"/>
+          </w:tblCellMar>
+        </w:tblPrEx>
+        <w:tc>
+          <w:tcPr>
+            <w:tcW w:w="0" w:type="auto"/>
+          </w:tcPr>
+          <w:p>
+            <w:r>
+              <w:t>Wien bridge</w:t>
+            </w:r>
+          </w:p>
+        </w:tc>
+        <w:tc>
+          <w:tcPr>
+            <w:tcW w:w="0" w:type="auto"/>
+          </w:tcPr>
+          <w:p>
+            <w:r>
+              <w:t>f₀ = 1/(2πRC);  gain 3</w:t>
+            </w:r>
+          </w:p>
+        </w:tc>
+      </w:tr>
+      <w:tr>
+        <w:tblPrEx>
+          <w:tblCellMar>
+            <w:top w:w="0" w:type="dxa"/>
+            <w:bottom w:w="0" w:type="dxa"/>
+          </w:tblCellMar>
+        </w:tblPrEx>
+        <w:tc>
+          <w:tcPr>
+            <w:tcW w:w="0" w:type="auto"/>
+          </w:tcPr>
+          <w:p>
+            <w:r>
+              <w:t>Relaxation oscillator</w:t>
+            </w:r>
+          </w:p>
+        </w:tc>
+        <w:tc>
+          <w:tcPr>
+            <w:tcW w:w="0" w:type="auto"/>
+          </w:tcPr>
+          <w:p>
+            <w:r>
+              <w:t>T = 2RC ln((1 + β)/(1 − β))</w:t>
+            </w:r>
+          </w:p>
+        </w:tc>
+      </w:tr>
+      <w:tr>
+        <w:tblPrEx>
+          <w:tblCellMar>
+            <w:top w:w="0" w:type="dxa"/>
+            <w:bottom w:w="0" w:type="dxa"/>
+          </w:tblCellMar>
+        </w:tblPrEx>
+        <w:tc>
+          <w:tcPr>
+            <w:tcW w:w="0" w:type="auto"/>
+          </w:tcPr>
+          <w:p>
+            <w:r>
+              <w:t>555 astable</w:t>
+            </w:r>
+          </w:p>
+        </w:tc>
+        <w:tc>
+          <w:tcPr>
+            <w:tcW w:w="0" w:type="auto"/>
+          </w:tcPr>
+          <w:p>
+            <w:r>
+              <w:t>f = 1.44/((R₁ + 2R₂)C);  duty (R₁ + R₂)/(R₁ + 2R₂)</w:t>
+            </w:r>
+          </w:p>
+        </w:tc>
+      </w:tr>
+      <w:tr>
+        <w:tblPrEx>
+          <w:tblCellMar>
+            <w:top w:w="0" w:type="dxa"/>
+            <w:bottom w:w="0" w:type="dxa"/>
+          </w:tblCellMar>
+        </w:tblPrEx>
+        <w:tc>
+          <w:tcPr>
+            <w:tcW w:w="0" w:type="auto"/>
+          </w:tcPr>
+          <w:p>
+            <w:r>
+              <w:t>Setup and hold</w:t>
+            </w:r>
+          </w:p>
+        </w:tc>
+        <w:tc>
+          <w:tcPr>
+            <w:tcW w:w="0" w:type="auto"/>
+          </w:tcPr>
+          <w:p>
+            <w:r>
+              <w:t>T_clk ≥ t_cq + t_pd + t_su + t_skew;  t_cq + t_cd ≥ t_h + t_skew</w:t>
+            </w:r>
+          </w:p>
+        </w:tc>
+      </w:tr>
+      <w:tr>
+        <w:tblPrEx>
+          <w:tblCellMar>
+            <w:top w:w="0" w:type="dxa"/>
+            <w:bottom w:w="0" w:type="dxa"/>
+          </w:tblCellMar>
+        </w:tblPrEx>
+        <w:tc>
+          <w:tcPr>
+            <w:tcW w:w="0" w:type="auto"/>
+          </w:tcPr>
+          <w:p>
+            <w:r>
+              <w:t>Synchronizer MTBF</w:t>
+            </w:r>
+          </w:p>
+        </w:tc>
+        <w:tc>
+          <w:tcPr>
+            <w:tcW w:w="0" w:type="auto"/>
+          </w:tcPr>
+          <w:p>
+            <w:r>
+              <w:t>e^(t_r/τ)/(T_w f_clk f_data)</w:t>
+            </w:r>
+          </w:p>
+        </w:tc>
+      </w:tr>
     </w:tbl>
     <w:p>
       <w:pPr>
@@ -17714,6 +19694,322 @@
     </w:p>
     <w:p>
       <w:pPr>
+        <w:pStyle w:val="Heading2"/>
+      </w:pPr>
+      <w:r>
+        <w:rPr>
+          <w:rFonts w:ascii="Amazon Ember" w:hAnsi="Amazon Ember" w:cs="Amazon Ember"/>
+          <w:color w:val="0000FF"/>
+          <w:sz w:val="36"/>
+        </w:rPr>
+        <w:t xml:space="preserve">Chapter 29 Solutions</w:t>
+      </w:r>
+    </w:p>
+    <w:p>
+      <w:pPr/>
+      <w:r>
+        <w:rPr>
+          <w:rFonts w:ascii="Calibri" w:hAnsi="Calibri" w:cs="Calibri"/>
+          <w:color w:val="000000"/>
+          <w:sz w:val="22"/>
+        </w:rPr>
+        <w:t xml:space="preserve">1. s² + 6s + K: 2ζω_n = 6 gives ω_n = 4.24 rad/s and K = ω_n² = 18.</w:t>
+      </w:r>
+    </w:p>
+    <w:p>
+      <w:pPr/>
+      <w:r>
+        <w:rPr>
+          <w:rFonts w:ascii="Calibri" w:hAnsi="Calibri" w:cs="Calibri"/>
+          <w:color w:val="000000"/>
+          <w:sz w:val="22"/>
+        </w:rPr>
+        <w:t xml:space="preserve">2. The poles meet midway, at s = −3, where K = 3 × 3 = 9.</w:t>
+      </w:r>
+    </w:p>
+    <w:p>
+      <w:pPr/>
+      <w:r>
+        <w:rPr>
+          <w:rFonts w:ascii="Calibri" w:hAnsi="Calibri" w:cs="Calibri"/>
+          <w:color w:val="000000"/>
+          <w:sz w:val="22"/>
+        </w:rPr>
+        <w:t xml:space="preserve">3. σ = (0 − 1 − 5)/3 = −2; angles ±60° and 180°.</w:t>
+      </w:r>
+    </w:p>
+    <w:p>
+      <w:pPr/>
+      <w:r>
+        <w:rPr>
+          <w:rFonts w:ascii="Calibri" w:hAnsi="Calibri" w:cs="Calibri"/>
+          <w:color w:val="000000"/>
+          <w:sz w:val="22"/>
+        </w:rPr>
+        <w:t xml:space="preserve">4. s³ + 6s² + 5s + K: the Routh s¹ entry (30 − K)/6 vanishes at K = 30, and 6s² + 30 = 0 gives ω = √5 = 2.24 rad/s.</w:t>
+      </w:r>
+    </w:p>
+    <w:p>
+      <w:pPr/>
+      <w:r>
+        <w:rPr>
+          <w:rFonts w:ascii="Calibri" w:hAnsi="Calibri" w:cs="Calibri"/>
+          <w:color w:val="000000"/>
+          <w:sz w:val="22"/>
+        </w:rPr>
+        <w:t xml:space="preserve">5. exp(−πζ/√(1 − ζ²)) = exp(−1.814) = 16.3%.</w:t>
+      </w:r>
+    </w:p>
+    <w:p>
+      <w:pPr/>
+      <w:r>
+        <w:rPr>
+          <w:rFonts w:ascii="Calibri" w:hAnsi="Calibri" w:cs="Calibri"/>
+          <w:color w:val="000000"/>
+          <w:sz w:val="22"/>
+        </w:rPr>
+        <w:t xml:space="preserve">6. Between 0 and −2, and to the left of −10, where an odd number of poles lies to the right.</w:t>
+      </w:r>
+    </w:p>
+    <w:p>
+      <w:pPr>
+        <w:pStyle w:val="Heading2"/>
+      </w:pPr>
+      <w:r>
+        <w:rPr>
+          <w:rFonts w:ascii="Amazon Ember" w:hAnsi="Amazon Ember" w:cs="Amazon Ember"/>
+          <w:color w:val="0000FF"/>
+          <w:sz w:val="36"/>
+        </w:rPr>
+        <w:t xml:space="preserve">Chapter 30 Solutions</w:t>
+      </w:r>
+    </w:p>
+    <w:p>
+      <w:pPr/>
+      <w:r>
+        <w:rPr>
+          <w:rFonts w:ascii="Calibri" w:hAnsi="Calibri" w:cs="Calibri"/>
+          <w:color w:val="000000"/>
+          <w:sz w:val="22"/>
+        </w:rPr>
+        <w:t xml:space="preserve">1. Z is the number of unstable closed-loop poles, N the number of clockwise encirclements of −1, and P the number of unstable open-loop poles. With P = 0, stability requires N = 0: the curve must not encircle −1.</w:t>
+      </w:r>
+    </w:p>
+    <w:p>
+      <w:pPr/>
+      <w:r>
+        <w:rPr>
+          <w:rFonts w:ascii="Calibri" w:hAnsi="Calibri" w:cs="Calibri"/>
+          <w:color w:val="000000"/>
+          <w:sz w:val="22"/>
+        </w:rPr>
+        <w:t xml:space="preserve">2. GM = 240/48 = 5, which is 14.0 dB.</w:t>
+      </w:r>
+    </w:p>
+    <w:p>
+      <w:pPr/>
+      <w:r>
+        <w:rPr>
+          <w:rFonts w:ascii="Calibri" w:hAnsi="Calibri" w:cs="Calibri"/>
+          <w:color w:val="000000"/>
+          <w:sz w:val="22"/>
+        </w:rPr>
+        <w:t xml:space="preserve">3. τ_max = (π/4)/10 = 0.0785 s, about 79 ms.</w:t>
+      </w:r>
+    </w:p>
+    <w:p>
+      <w:pPr/>
+      <w:r>
+        <w:rPr>
+          <w:rFonts w:ascii="Calibri" w:hAnsi="Calibri" w:cs="Calibri"/>
+          <w:color w:val="000000"/>
+          <w:sz w:val="22"/>
+        </w:rPr>
+        <w:t xml:space="preserve">4. GM ≥ 1.4/0.4 = 3.5 (10.9 dB); PM ≥ 2 arcsin(1/2.8) = 41.8°.</w:t>
+      </w:r>
+    </w:p>
+    <w:p>
+      <w:pPr/>
+      <w:r>
+        <w:rPr>
+          <w:rFonts w:ascii="Calibri" w:hAnsi="Calibri" w:cs="Calibri"/>
+          <w:color w:val="000000"/>
+          <w:sz w:val="22"/>
+        </w:rPr>
+        <w:t xml:space="preserve">5. 51.7° = 0.903 rad; 0.903/1.217 = 0.74 s.</w:t>
+      </w:r>
+    </w:p>
+    <w:p>
+      <w:pPr/>
+      <w:r>
+        <w:rPr>
+          <w:rFonts w:ascii="Calibri" w:hAnsi="Calibri" w:cs="Calibri"/>
+          <w:color w:val="000000"/>
+          <w:sz w:val="22"/>
+        </w:rPr>
+        <w:t xml:space="preserve">6. The integral of ln|S| over frequency is zero for most stable loops, so reducing |S| below 1 over some band forces it above 1 over another, like pressing down on a waterbed.</w:t>
+      </w:r>
+    </w:p>
+    <w:p>
+      <w:pPr>
+        <w:pStyle w:val="Heading2"/>
+      </w:pPr>
+      <w:r>
+        <w:rPr>
+          <w:rFonts w:ascii="Amazon Ember" w:hAnsi="Amazon Ember" w:cs="Amazon Ember"/>
+          <w:color w:val="0000FF"/>
+          <w:sz w:val="36"/>
+        </w:rPr>
+        <w:t xml:space="preserve">Chapter 31 Solutions</w:t>
+      </w:r>
+    </w:p>
+    <w:p>
+      <w:pPr/>
+      <w:r>
+        <w:rPr>
+          <w:rFonts w:ascii="Calibri" w:hAnsi="Calibri" w:cs="Calibri"/>
+          <w:color w:val="000000"/>
+          <w:sz w:val="22"/>
+        </w:rPr>
+        <w:t xml:space="preserve">1. f₀ = 1/(2π × 4,700 × 22 × 10⁻⁹) = 1,539 Hz.</w:t>
+      </w:r>
+    </w:p>
+    <w:p>
+      <w:pPr/>
+      <w:r>
+        <w:rPr>
+          <w:rFonts w:ascii="Calibri" w:hAnsi="Calibri" w:cs="Calibri"/>
+          <w:color w:val="000000"/>
+          <w:sz w:val="22"/>
+        </w:rPr>
+        <w:t xml:space="preserve">2. T = 2RC ln 2 = 2 × 10⁻⁴ × 0.693 = 138.6 µs, so f = 7.21 kHz.</w:t>
+      </w:r>
+    </w:p>
+    <w:p>
+      <w:pPr/>
+      <w:r>
+        <w:rPr>
+          <w:rFonts w:ascii="Calibri" w:hAnsi="Calibri" w:cs="Calibri"/>
+          <w:color w:val="000000"/>
+          <w:sz w:val="22"/>
+        </w:rPr>
+        <w:t xml:space="preserve">3. f = 1.44/(30 kΩ × 100 nF) = 480 Hz; duty (10 + 10)/(10 + 20) = 66.7%.</w:t>
+      </w:r>
+    </w:p>
+    <w:p>
+      <w:pPr/>
+      <w:r>
+        <w:rPr>
+          <w:rFonts w:ascii="Calibri" w:hAnsi="Calibri" w:cs="Calibri"/>
+          <w:color w:val="000000"/>
+          <w:sz w:val="22"/>
+        </w:rPr>
+        <w:t xml:space="preserve">4. The series capacitance is 500 pF, so f₀ = 1/(2π√(10⁻⁵ × 5 × 10⁻¹⁰)) = 2.25 MHz.</w:t>
+      </w:r>
+    </w:p>
+    <w:p>
+      <w:pPr/>
+      <w:r>
+        <w:rPr>
+          <w:rFonts w:ascii="Calibri" w:hAnsi="Calibri" w:cs="Calibri"/>
+          <w:color w:val="000000"/>
+          <w:sz w:val="22"/>
+        </w:rPr>
+        <w:t xml:space="preserve">5. C_L = 33/2 + 4 = 20.5 pF.</w:t>
+      </w:r>
+    </w:p>
+    <w:p>
+      <w:pPr/>
+      <w:r>
+        <w:rPr>
+          <w:rFonts w:ascii="Calibri" w:hAnsi="Calibri" w:cs="Calibri"/>
+          <w:color w:val="000000"/>
+          <w:sz w:val="22"/>
+        </w:rPr>
+        <w:t xml:space="preserve">6. The loop gain must be exactly one; with a fixed gain slightly above one the amplitude grows until the amplifier clips and distorts, and slightly below one it dies away. A gain that falls as the amplitude rises holds it at one.</w:t>
+      </w:r>
+    </w:p>
+    <w:p>
+      <w:pPr>
+        <w:pStyle w:val="Heading2"/>
+      </w:pPr>
+      <w:r>
+        <w:rPr>
+          <w:rFonts w:ascii="Amazon Ember" w:hAnsi="Amazon Ember" w:cs="Amazon Ember"/>
+          <w:color w:val="0000FF"/>
+          <w:sz w:val="36"/>
+        </w:rPr>
+        <w:t xml:space="preserve">Chapter 32 Solutions</w:t>
+      </w:r>
+    </w:p>
+    <w:p>
+      <w:pPr/>
+      <w:r>
+        <w:rPr>
+          <w:rFonts w:ascii="Calibri" w:hAnsi="Calibri" w:cs="Calibri"/>
+          <w:color w:val="000000"/>
+          <w:sz w:val="22"/>
+        </w:rPr>
+        <w:t xml:space="preserve">1. T_clk ≥ 0.4 + 4.0 + 0.2 + 0.1 = 4.7 ns, so f_max = 212.8 MHz.</w:t>
+      </w:r>
+    </w:p>
+    <w:p>
+      <w:pPr/>
+      <w:r>
+        <w:rPr>
+          <w:rFonts w:ascii="Calibri" w:hAnsi="Calibri" w:cs="Calibri"/>
+          <w:color w:val="000000"/>
+          <w:sz w:val="22"/>
+        </w:rPr>
+        <w:t xml:space="preserve">2. t_cq + t_cd = 0.40 ns, but t_h + t_skew = 0.45 ns, so it fails hold by 0.05 ns; add delay to the short path.</w:t>
+      </w:r>
+    </w:p>
+    <w:p>
+      <w:pPr/>
+      <w:r>
+        <w:rPr>
+          <w:rFonts w:ascii="Calibri" w:hAnsi="Calibri" w:cs="Calibri"/>
+          <w:color w:val="000000"/>
+          <w:sz w:val="22"/>
+        </w:rPr>
+        <w:t xml:space="preserve">3. e^(30)/(2 × 10⁵) = 5.3 × 10⁷ s, about 1.7 years.</w:t>
+      </w:r>
+    </w:p>
+    <w:p>
+      <w:pPr/>
+      <w:r>
+        <w:rPr>
+          <w:rFonts w:ascii="Calibri" w:hAnsi="Calibri" w:cs="Calibri"/>
+          <w:color w:val="000000"/>
+          <w:sz w:val="22"/>
+        </w:rPr>
+        <w:t xml:space="preserve">4. A factor of e, about 2.72.</w:t>
+      </w:r>
+    </w:p>
+    <w:p>
+      <w:pPr/>
+      <w:r>
+        <w:rPr>
+          <w:rFonts w:ascii="Calibri" w:hAnsi="Calibri" w:cs="Calibri"/>
+          <w:color w:val="000000"/>
+          <w:sz w:val="22"/>
+        </w:rPr>
+        <w:t xml:space="preserve">5. Only one bit changes per increment, so a value captured during a change is either the old or the new pointer, never a value that never existed.</w:t>
+      </w:r>
+    </w:p>
+    <w:p>
+      <w:pPr/>
+      <w:r>
+        <w:rPr>
+          <w:rFonts w:ascii="Calibri" w:hAnsi="Calibri" w:cs="Calibri"/>
+          <w:color w:val="000000"/>
+          <w:sz w:val="22"/>
+        </w:rPr>
+        <w:t xml:space="preserve">6. 10 − 7.0 = 3.0 ns of positive slack.</w:t>
+      </w:r>
+    </w:p>
+    <w:p>
+      <w:pPr>
         <w:pStyle w:val="Heading1"/>
         <w:pageBreakBefore/>
         <w:spacing w:before="480" w:after="240"/>
@@ -17792,6 +20088,21 @@
           <w:b/>
           <w:bCs/>
         </w:rPr>
+        <w:t xml:space="preserve">Angle condition — </w:t>
+      </w:r>
+      <w:r>
+        <w:t xml:space="preserve">The requirement that ∠G(s) be an odd multiple of 180° for s to lie on the root locus.</w:t>
+      </w:r>
+    </w:p>
+    <w:p>
+      <w:pPr>
+        <w:spacing w:after="200" w:line="276" w:lineRule="auto"/>
+      </w:pPr>
+      <w:r>
+        <w:rPr>
+          <w:b/>
+          <w:bCs/>
+        </w:rPr>
         <w:t xml:space="preserve">Antiresonance — </w:t>
       </w:r>
       <w:r>
@@ -17822,6 +20133,21 @@
           <w:b/>
           <w:bCs/>
         </w:rPr>
+        <w:t xml:space="preserve">Asymptote centroid — </w:t>
+      </w:r>
+      <w:r>
+        <w:t xml:space="preserve">The point on the real axis, (Σ poles − Σ zeros)/(n − m), from which the root-locus asymptotes radiate.</w:t>
+      </w:r>
+    </w:p>
+    <w:p>
+      <w:pPr>
+        <w:spacing w:after="200" w:line="276" w:lineRule="auto"/>
+      </w:pPr>
+      <w:r>
+        <w:rPr>
+          <w:b/>
+          <w:bCs/>
+        </w:rPr>
         <w:t xml:space="preserve">Backward Euler — </w:t>
       </w:r>
       <w:r>
@@ -17852,6 +20178,21 @@
           <w:b/>
           <w:bCs/>
         </w:rPr>
+        <w:t xml:space="preserve">Barkhausen condition — </w:t>
+      </w:r>
+      <w:r>
+        <w:t xml:space="preserve">Loop gain of exactly one with a phase shift of zero (or 360°), the condition for a sustained oscillation.</w:t>
+      </w:r>
+    </w:p>
+    <w:p>
+      <w:pPr>
+        <w:spacing w:after="200" w:line="276" w:lineRule="auto"/>
+      </w:pPr>
+      <w:r>
+        <w:rPr>
+          <w:b/>
+          <w:bCs/>
+        </w:rPr>
         <w:t xml:space="preserve">Bessel response — </w:t>
       </w:r>
       <w:r>
@@ -17927,6 +20268,21 @@
           <w:b/>
           <w:bCs/>
         </w:rPr>
+        <w:t xml:space="preserve">Breakaway point — </w:t>
+      </w:r>
+      <w:r>
+        <w:t xml:space="preserve">A point on the real axis where two branches of the root locus meet and leave the axis.</w:t>
+      </w:r>
+    </w:p>
+    <w:p>
+      <w:pPr>
+        <w:spacing w:after="200" w:line="276" w:lineRule="auto"/>
+      </w:pPr>
+      <w:r>
+        <w:rPr>
+          <w:b/>
+          <w:bCs/>
+        </w:rPr>
         <w:t xml:space="preserve">Buffer — </w:t>
       </w:r>
       <w:r>
@@ -18002,6 +20358,21 @@
           <w:b/>
           <w:bCs/>
         </w:rPr>
+        <w:t xml:space="preserve">Clock skew — </w:t>
+      </w:r>
+      <w:r>
+        <w:t xml:space="preserve">The difference in arrival time of the same clock edge at two flip-flops.</w:t>
+      </w:r>
+    </w:p>
+    <w:p>
+      <w:pPr>
+        <w:spacing w:after="200" w:line="276" w:lineRule="auto"/>
+      </w:pPr>
+      <w:r>
+        <w:rPr>
+          <w:b/>
+          <w:bCs/>
+        </w:rPr>
         <w:t xml:space="preserve">Combinational circuit — </w:t>
       </w:r>
       <w:r>
@@ -18122,6 +20493,21 @@
           <w:b/>
           <w:bCs/>
         </w:rPr>
+        <w:t xml:space="preserve">Delay margin — </w:t>
+      </w:r>
+      <w:r>
+        <w:t xml:space="preserve">The largest added time delay a loop can tolerate before instability, PM in radians divided by the crossover frequency.</w:t>
+      </w:r>
+    </w:p>
+    <w:p>
+      <w:pPr>
+        <w:spacing w:after="200" w:line="276" w:lineRule="auto"/>
+      </w:pPr>
+      <w:r>
+        <w:rPr>
+          <w:b/>
+          <w:bCs/>
+        </w:rPr>
         <w:t xml:space="preserve">Derating curve — </w:t>
       </w:r>
       <w:r>
@@ -18407,6 +20793,21 @@
           <w:b/>
           <w:bCs/>
         </w:rPr>
+        <w:t xml:space="preserve">Hold time — </w:t>
+      </w:r>
+      <w:r>
+        <w:t xml:space="preserve">The interval after a clock edge during which a flip-flop's input must remain stable.</w:t>
+      </w:r>
+    </w:p>
+    <w:p>
+      <w:pPr>
+        <w:spacing w:after="200" w:line="276" w:lineRule="auto"/>
+      </w:pPr>
+      <w:r>
+        <w:rPr>
+          <w:b/>
+          <w:bCs/>
+        </w:rPr>
         <w:t xml:space="preserve">Hysteresis — </w:t>
       </w:r>
       <w:r>
@@ -18632,6 +21033,21 @@
           <w:b/>
           <w:bCs/>
         </w:rPr>
+        <w:t xml:space="preserve">Load capacitance — </w:t>
+      </w:r>
+      <w:r>
+        <w:t xml:space="preserve">The capacitance a crystal must see across its terminals to oscillate at its marked frequency.</w:t>
+      </w:r>
+    </w:p>
+    <w:p>
+      <w:pPr>
+        <w:spacing w:after="200" w:line="276" w:lineRule="auto"/>
+      </w:pPr>
+      <w:r>
+        <w:rPr>
+          <w:b/>
+          <w:bCs/>
+        </w:rPr>
         <w:t xml:space="preserve">Loop gain (T) — </w:t>
       </w:r>
       <w:r>
@@ -18647,6 +21063,21 @@
           <w:b/>
           <w:bCs/>
         </w:rPr>
+        <w:t xml:space="preserve">Metastability — </w:t>
+      </w:r>
+      <w:r>
+        <w:t xml:space="preserve">A flip-flop state between 0 and 1, caused by an input change inside the setup-hold window, that resolves after a random time.</w:t>
+      </w:r>
+    </w:p>
+    <w:p>
+      <w:pPr>
+        <w:spacing w:after="200" w:line="276" w:lineRule="auto"/>
+      </w:pPr>
+      <w:r>
+        <w:rPr>
+          <w:b/>
+          <w:bCs/>
+        </w:rPr>
         <w:t xml:space="preserve">Microphonics — </w:t>
       </w:r>
       <w:r>
@@ -18707,6 +21138,21 @@
           <w:b/>
           <w:bCs/>
         </w:rPr>
+        <w:t xml:space="preserve">Nyquist plot — </w:t>
+      </w:r>
+      <w:r>
+        <w:t xml:space="preserve">The curve traced by L(jω) in the complex plane as ω runs over all frequencies.</w:t>
+      </w:r>
+    </w:p>
+    <w:p>
+      <w:pPr>
+        <w:spacing w:after="200" w:line="276" w:lineRule="auto"/>
+      </w:pPr>
+      <w:r>
+        <w:rPr>
+          <w:b/>
+          <w:bCs/>
+        </w:rPr>
         <w:t xml:space="preserve">Observer — </w:t>
       </w:r>
       <w:r>
@@ -18887,6 +21333,36 @@
           <w:b/>
           <w:bCs/>
         </w:rPr>
+        <w:t xml:space="preserve">Relaxation oscillator — </w:t>
+      </w:r>
+      <w:r>
+        <w:t xml:space="preserve">An oscillator that charges and discharges a capacitor between two thresholds rather than using a resonant network.</w:t>
+      </w:r>
+    </w:p>
+    <w:p>
+      <w:pPr>
+        <w:spacing w:after="200" w:line="276" w:lineRule="auto"/>
+      </w:pPr>
+      <w:r>
+        <w:rPr>
+          <w:b/>
+          <w:bCs/>
+        </w:rPr>
+        <w:t xml:space="preserve">Root locus — </w:t>
+      </w:r>
+      <w:r>
+        <w:t xml:space="preserve">The paths of the closed-loop poles in the s-plane as a loop gain varies from zero to infinity.</w:t>
+      </w:r>
+    </w:p>
+    <w:p>
+      <w:pPr>
+        <w:spacing w:after="200" w:line="276" w:lineRule="auto"/>
+      </w:pPr>
+      <w:r>
+        <w:rPr>
+          <w:b/>
+          <w:bCs/>
+        </w:rPr>
         <w:t xml:space="preserve">Sallen-Key filter — </w:t>
       </w:r>
       <w:r>
@@ -18947,6 +21423,21 @@
           <w:b/>
           <w:bCs/>
         </w:rPr>
+        <w:t xml:space="preserve">Sensitivity function — </w:t>
+      </w:r>
+      <w:r>
+        <w:t xml:space="preserve">S = 1/(1 + L), the factor by which feedback changes the effect of disturbances and plant variations at each frequency.</w:t>
+      </w:r>
+    </w:p>
+    <w:p>
+      <w:pPr>
+        <w:spacing w:after="200" w:line="276" w:lineRule="auto"/>
+      </w:pPr>
+      <w:r>
+        <w:rPr>
+          <w:b/>
+          <w:bCs/>
+        </w:rPr>
         <w:t xml:space="preserve">Separation principle — </w:t>
       </w:r>
       <w:r>
@@ -18977,6 +21468,21 @@
           <w:b/>
           <w:bCs/>
         </w:rPr>
+        <w:t xml:space="preserve">Setup time — </w:t>
+      </w:r>
+      <w:r>
+        <w:t xml:space="preserve">The interval before a clock edge during which a flip-flop's input must be stable.</w:t>
+      </w:r>
+    </w:p>
+    <w:p>
+      <w:pPr>
+        <w:spacing w:after="200" w:line="276" w:lineRule="auto"/>
+      </w:pPr>
+      <w:r>
+        <w:rPr>
+          <w:b/>
+          <w:bCs/>
+        </w:rPr>
         <w:t xml:space="preserve">Shoot-through — </w:t>
       </w:r>
       <w:r>
@@ -19097,6 +21603,21 @@
           <w:b/>
           <w:bCs/>
         </w:rPr>
+        <w:t xml:space="preserve">Synchronizer — </w:t>
+      </w:r>
+      <w:r>
+        <w:t xml:space="preserve">A chain of flip-flops, usually two, that gives a metastable state time to resolve before the signal is used.</w:t>
+      </w:r>
+    </w:p>
+    <w:p>
+      <w:pPr>
+        <w:spacing w:after="200" w:line="276" w:lineRule="auto"/>
+      </w:pPr>
+      <w:r>
+        <w:rPr>
+          <w:b/>
+          <w:bCs/>
+        </w:rPr>
         <w:t xml:space="preserve">Target impedance — </w:t>
       </w:r>
       <w:r>
@@ -19146,6 +21667,36 @@
       </w:r>
       <w:r>
         <w:t xml:space="preserve">A control loop containing one integrator, which tracks a constant reference with zero steady-state error.</w:t>
+      </w:r>
+    </w:p>
+    <w:p>
+      <w:pPr>
+        <w:spacing w:after="200" w:line="276" w:lineRule="auto"/>
+      </w:pPr>
+      <w:r>
+        <w:rPr>
+          <w:b/>
+          <w:bCs/>
+        </w:rPr>
+        <w:t xml:space="preserve">Waterbed effect — </w:t>
+      </w:r>
+      <w:r>
+        <w:t xml:space="preserve">The consequence of Bode's sensitivity integral that lowering |S| in one band raises it in another.</w:t>
+      </w:r>
+    </w:p>
+    <w:p>
+      <w:pPr>
+        <w:spacing w:after="200" w:line="276" w:lineRule="auto"/>
+      </w:pPr>
+      <w:r>
+        <w:rPr>
+          <w:b/>
+          <w:bCs/>
+        </w:rPr>
+        <w:t xml:space="preserve">Wien bridge — </w:t>
+      </w:r>
+      <w:r>
+        <w:t xml:space="preserve">An RC network with zero phase shift and a gain of 1/3 at f = 1/(2πRC), used in low-distortion audio oscillators.</w:t>
       </w:r>
     </w:p>
     <w:p>
@@ -19653,6 +22204,74 @@
     </w:p>
     <w:p>
       <w:pPr>
+        <w:pStyle w:val="Heading2"/>
+        <w:spacing w:before="360" w:after="160"/>
+      </w:pPr>
+      <w:r>
+        <w:t xml:space="preserve">Chapter 29</w:t>
+      </w:r>
+    </w:p>
+    <w:p>
+      <w:pPr>
+        <w:spacing w:after="200" w:line="276" w:lineRule="auto"/>
+      </w:pPr>
+      <w:r>
+        <w:t xml:space="preserve">The root locus traces the closed-loop poles as one gain varies. Branches start at the open-loop poles and end at the zeros or along asymptotes at (2k + 1)180°/(n − m) from the centroid. A second-order plant 1/(s(s + 4)) cannot settle faster than 2 s by gain alone; the third-order plant 1/(s(s + 2)(s + 10)) breaks away at −0.945, reaches ζ = 0.5 at K = 28.7, and goes unstable at K = 240 and 4.47 rad/s. Lead control bends the locus left; lag control raises low-frequency gain while leaving it nearly unchanged.</w:t>
+      </w:r>
+    </w:p>
+    <w:p>
+      <w:pPr>
+        <w:pStyle w:val="Heading2"/>
+        <w:spacing w:before="360" w:after="160"/>
+      </w:pPr>
+      <w:r>
+        <w:t xml:space="preserve">Chapter 30</w:t>
+      </w:r>
+    </w:p>
+    <w:p>
+      <w:pPr>
+        <w:spacing w:after="200" w:line="276" w:lineRule="auto"/>
+      </w:pPr>
+      <w:r>
+        <w:t xml:space="preserve">The Nyquist criterion counts encirclements of −1 by L(jω): Z = N + P. Gain margin is read where the phase is −180°, phase margin where |L| = 1, and the delay margin is PM/ω_c. For L = K/(s(s + 2)(s + 10)), K = 28.7 gives 18.4 dB, 51.7°, and 0.74 s; K = 60 gives 12.0 dB, 32.7°, and 0.28 s. The sensitivity peak M_s bounds both margins, GM ≥ M_s/(M_s − 1) and PM ≥ 2 arcsin(1/(2M_s)), and a value of 1.2 to 2 is a good target.</w:t>
+      </w:r>
+    </w:p>
+    <w:p>
+      <w:pPr>
+        <w:pStyle w:val="Heading2"/>
+        <w:spacing w:before="360" w:after="160"/>
+      </w:pPr>
+      <w:r>
+        <w:t xml:space="preserve">Chapter 31</w:t>
+      </w:r>
+    </w:p>
+    <w:p>
+      <w:pPr>
+        <w:spacing w:after="200" w:line="276" w:lineRule="auto"/>
+      </w:pPr>
+      <w:r>
+        <w:t xml:space="preserve">An oscillator satisfies the Barkhausen condition, Aβ = 1 at zero phase, at one frequency. The Wien bridge runs at 1/(2πRC) with a gain of 3; the phase-shift oscillator at 1/(2π√6RC) with a gain of 29; the Colpitts at the resonance of L with C₁ and C₂ in series. Relaxation oscillators charge a capacitor between two thresholds: T = 2RC ln((1 + β)/(1 − β)), and the 555 runs at 1.44/((R₁ + 2R₂)C). A crystal in a Pierce circuit needs its specified load capacitance, the series pair plus stray.</w:t>
+      </w:r>
+    </w:p>
+    <w:p>
+      <w:pPr>
+        <w:pStyle w:val="Heading2"/>
+        <w:spacing w:before="360" w:after="160"/>
+      </w:pPr>
+      <w:r>
+        <w:t xml:space="preserve">Chapter 32</w:t>
+      </w:r>
+    </w:p>
+    <w:p>
+      <w:pPr>
+        <w:spacing w:after="200" w:line="276" w:lineRule="auto"/>
+      </w:pPr>
+      <w:r>
+        <w:t xml:space="preserve">A path between flip-flops passes setup if T_clk ≥ t_cq + t_pd + t_su + t_skew and hold if t_cq + t_cd ≥ t_h + t_skew; a 7.0 ns path runs at 142.9 MHz, and a hold violation persists at any clock rate. An asynchronous input can leave a flip-flop metastable; MTBF = e^(t_r/τ)/(T_w f_clk f_data) rises from 40 minutes at 1.0 ns of resolution time to 10²⁶ years at 4.5 ns, which is why two-flip-flop synchronizers, Gray codes, and handshakes guard every clock-domain crossing.</w:t>
+      </w:r>
+    </w:p>
+    <w:p>
+      <w:pPr>
         <w:pStyle w:val="Heading1"/>
         <w:pageBreakBefore/>
         <w:spacing w:before="480" w:after="240"/>
@@ -19863,6 +22482,66 @@
       </w:r>
       <w:r>
         <w:t xml:space="preserve">the next step after Chapter 28, from the DC motor drive to AC machines and their control.</w:t>
+      </w:r>
+    </w:p>
+    <w:p>
+      <w:pPr>
+        <w:spacing w:after="200" w:line="276" w:lineRule="auto"/>
+      </w:pPr>
+      <w:r>
+        <w:rPr>
+          <w:b/>
+          <w:bCs/>
+        </w:rPr>
+        <w:t xml:space="preserve">Karl Johan Åström and Richard M. Murray, Feedback Systems, 2nd edition — </w:t>
+      </w:r>
+      <w:r>
+        <w:t xml:space="preserve">the source of Chapter 30's sensitivity-peak bounds and the Nyquist treatment, with the waterbed effect developed fully.</w:t>
+      </w:r>
+    </w:p>
+    <w:p>
+      <w:pPr>
+        <w:spacing w:after="200" w:line="276" w:lineRule="auto"/>
+      </w:pPr>
+      <w:r>
+        <w:rPr>
+          <w:b/>
+          <w:bCs/>
+        </w:rPr>
+        <w:t xml:space="preserve">Norman S. Nise, Control Systems Engineering, 8th edition — </w:t>
+      </w:r>
+      <w:r>
+        <w:t xml:space="preserve">root-locus sketching rules and compensator design through the locus, the next step after Chapter 29.</w:t>
+      </w:r>
+    </w:p>
+    <w:p>
+      <w:pPr>
+        <w:spacing w:after="200" w:line="276" w:lineRule="auto"/>
+      </w:pPr>
+      <w:r>
+        <w:rPr>
+          <w:b/>
+          <w:bCs/>
+        </w:rPr>
+        <w:t xml:space="preserve">Paul Horowitz and Winfield Hill, The Art of Electronics, 3rd edition — </w:t>
+      </w:r>
+      <w:r>
+        <w:t xml:space="preserve">oscillators, the 555, crystal circuits, and synchronizers in practice (Chapters 31 and 32).</w:t>
+      </w:r>
+    </w:p>
+    <w:p>
+      <w:pPr>
+        <w:spacing w:after="200" w:line="276" w:lineRule="auto"/>
+      </w:pPr>
+      <w:r>
+        <w:rPr>
+          <w:b/>
+          <w:bCs/>
+        </w:rPr>
+        <w:t xml:space="preserve">Clifford E. Cummings, Clock Domain Crossing (CDC) Design &amp; Verification Techniques Using SystemVerilog — </w:t>
+      </w:r>
+      <w:r>
+        <w:t xml:space="preserve">a widely used paper on synchronizers, Gray-coded FIFO pointers, and handshakes (Chapter 32).</w:t>
       </w:r>
     </w:p>
     <w:sectPr>
@@ -20612,6 +23291,30 @@
     </w:lvlOverride>
   </w:num>
   <w:num w:numId="28">
+    <w:abstractNumId w:val="6"/>
+    <w:lvlOverride w:ilvl="0">
+      <w:startOverride w:val="1"/>
+    </w:lvlOverride>
+  </w:num>
+  <w:num w:numId="29">
+    <w:abstractNumId w:val="6"/>
+    <w:lvlOverride w:ilvl="0">
+      <w:startOverride w:val="1"/>
+    </w:lvlOverride>
+  </w:num>
+  <w:num w:numId="30">
+    <w:abstractNumId w:val="6"/>
+    <w:lvlOverride w:ilvl="0">
+      <w:startOverride w:val="1"/>
+    </w:lvlOverride>
+  </w:num>
+  <w:num w:numId="31">
+    <w:abstractNumId w:val="6"/>
+    <w:lvlOverride w:ilvl="0">
+      <w:startOverride w:val="1"/>
+    </w:lvlOverride>
+  </w:num>
+  <w:num w:numId="32">
     <w:abstractNumId w:val="6"/>
     <w:lvlOverride w:ilvl="0">
       <w:startOverride w:val="1"/>

</xml_diff>